<commit_message>
Doplnenie dokumentacie o navrh a implementaciu prototypu
</commit_message>
<xml_diff>
--- a/documentation.docx
+++ b/documentation.docx
@@ -1,6 +1,6 @@
 
 <file path=word/document.xml><?xml version="1.0" encoding="utf-8"?>
-<w:document xmlns:wpc="http://schemas.microsoft.com/office/word/2010/wordprocessingCanvas" xmlns:cx="http://schemas.microsoft.com/office/drawing/2014/chartex" xmlns:cx1="http://schemas.microsoft.com/office/drawing/2015/9/8/chartex" xmlns:cx2="http://schemas.microsoft.com/office/drawing/2015/10/21/chartex" xmlns:cx3="http://schemas.microsoft.com/office/drawing/2016/5/9/chartex" xmlns:cx4="http://schemas.microsoft.com/office/drawing/2016/5/10/chartex" xmlns:cx5="http://schemas.microsoft.com/office/drawing/2016/5/11/chartex" xmlns:cx6="http://schemas.microsoft.com/office/drawing/2016/5/12/chartex" xmlns:cx7="http://schemas.microsoft.com/office/drawing/2016/5/13/chartex" xmlns:cx8="http://schemas.microsoft.com/office/drawing/2016/5/14/chartex" xmlns:mc="http://schemas.openxmlformats.org/markup-compatibility/2006" xmlns:aink="http://schemas.microsoft.com/office/drawing/2016/ink" xmlns:am3d="http://schemas.microsoft.com/office/drawing/2017/model3d" xmlns:o="urn:schemas-microsoft-com:office:office" xmlns:oel="http://schemas.microsoft.com/office/2019/extlst" xmlns:r="http://schemas.openxmlformats.org/officeDocument/2006/relationships" xmlns:m="http://schemas.openxmlformats.org/officeDocument/2006/math" xmlns:v="urn:schemas-microsoft-com:vml" xmlns:wp14="http://schemas.microsoft.com/office/word/2010/wordprocessingDrawing" xmlns:wp="http://schemas.openxmlformats.org/drawingml/2006/wordprocessingDrawing" xmlns:w10="urn:schemas-microsoft-com:office:word" xmlns:w="http://schemas.openxmlformats.org/wordprocessingml/2006/main" xmlns:w14="http://schemas.microsoft.com/office/word/2010/wordml" xmlns:w15="http://schemas.microsoft.com/office/word/2012/wordml" xmlns:w16cex="http://schemas.microsoft.com/office/word/2018/wordml/cex" xmlns:w16cid="http://schemas.microsoft.com/office/word/2016/wordml/cid" xmlns:w16="http://schemas.microsoft.com/office/word/2018/wordml" xmlns:w16du="http://schemas.microsoft.com/office/word/2023/wordml/word16du" xmlns:w16sdtdh="http://schemas.microsoft.com/office/word/2020/wordml/sdtdatahash" xmlns:w16sdtfl="http://schemas.microsoft.com/office/word/2024/wordml/sdtformatlock" xmlns:w16se="http://schemas.microsoft.com/office/word/2015/wordml/symex" xmlns:wpg="http://schemas.microsoft.com/office/word/2010/wordprocessingGroup" xmlns:wpi="http://schemas.microsoft.com/office/word/2010/wordprocessingInk" xmlns:wne="http://schemas.microsoft.com/office/word/2006/wordml" xmlns:wps="http://schemas.microsoft.com/office/word/2010/wordprocessingShape" xmlns:a="http://schemas.openxmlformats.org/drawingml/2006/main" xmlns:pic="http://schemas.openxmlformats.org/drawingml/2006/picture" xmlns:a14="http://schemas.microsoft.com/office/drawing/2010/main" mc:Ignorable="w14 w15 w16se w16cid w16 w16cex w16sdtdh w16sdtfl w16du wp14">
+<w:document xmlns:wpc="http://schemas.microsoft.com/office/word/2010/wordprocessingCanvas" xmlns:cx="http://schemas.microsoft.com/office/drawing/2014/chartex" xmlns:cx1="http://schemas.microsoft.com/office/drawing/2015/9/8/chartex" xmlns:cx2="http://schemas.microsoft.com/office/drawing/2015/10/21/chartex" xmlns:cx3="http://schemas.microsoft.com/office/drawing/2016/5/9/chartex" xmlns:cx4="http://schemas.microsoft.com/office/drawing/2016/5/10/chartex" xmlns:cx5="http://schemas.microsoft.com/office/drawing/2016/5/11/chartex" xmlns:cx6="http://schemas.microsoft.com/office/drawing/2016/5/12/chartex" xmlns:cx7="http://schemas.microsoft.com/office/drawing/2016/5/13/chartex" xmlns:cx8="http://schemas.microsoft.com/office/drawing/2016/5/14/chartex" xmlns:mc="http://schemas.openxmlformats.org/markup-compatibility/2006" xmlns:aink="http://schemas.microsoft.com/office/drawing/2016/ink" xmlns:am3d="http://schemas.microsoft.com/office/drawing/2017/model3d" xmlns:o="urn:schemas-microsoft-com:office:office" xmlns:oel="http://schemas.microsoft.com/office/2019/extlst" xmlns:r="http://schemas.openxmlformats.org/officeDocument/2006/relationships" xmlns:m="http://schemas.openxmlformats.org/officeDocument/2006/math" xmlns:v="urn:schemas-microsoft-com:vml" xmlns:wp14="http://schemas.microsoft.com/office/word/2010/wordprocessingDrawing" xmlns:wp="http://schemas.openxmlformats.org/drawingml/2006/wordprocessingDrawing" xmlns:w10="urn:schemas-microsoft-com:office:word" xmlns:w="http://schemas.openxmlformats.org/wordprocessingml/2006/main" xmlns:w14="http://schemas.microsoft.com/office/word/2010/wordml" xmlns:w15="http://schemas.microsoft.com/office/word/2012/wordml" xmlns:w16cex="http://schemas.microsoft.com/office/word/2018/wordml/cex" xmlns:w16cid="http://schemas.microsoft.com/office/word/2016/wordml/cid" xmlns:w16="http://schemas.microsoft.com/office/word/2018/wordml" xmlns:w16du="http://schemas.microsoft.com/office/word/2023/wordml/word16du" xmlns:w16sdtdh="http://schemas.microsoft.com/office/word/2020/wordml/sdtdatahash" xmlns:w16sdtfl="http://schemas.microsoft.com/office/word/2024/wordml/sdtformatlock" xmlns:w16se="http://schemas.microsoft.com/office/word/2015/wordml/symex" xmlns:wpg="http://schemas.microsoft.com/office/word/2010/wordprocessingGroup" xmlns:wpi="http://schemas.microsoft.com/office/word/2010/wordprocessingInk" xmlns:wne="http://schemas.microsoft.com/office/word/2006/wordml" xmlns:wps="http://schemas.microsoft.com/office/word/2010/wordprocessingShape" mc:Ignorable="w14 w15 w16se w16cid w16 w16cex w16sdtdh w16sdtfl w16du wp14">
   <w:body>
     <w:p>
       <w:pPr>
@@ -9,13 +9,12 @@
         <w:rPr>
           <w:b/>
           <w:sz w:val="34"/>
-          <w:lang w:val="sk-SK" w:eastAsia="en-US"/>
-        </w:rPr>
-      </w:pPr>
-      <w:r>
-        <w:rPr>
-          <w:noProof/>
-          <w:lang w:val="sk-SK"/>
+          <w:lang w:val="en-GB" w:eastAsia="en-US"/>
+        </w:rPr>
+      </w:pPr>
+      <w:r>
+        <w:rPr>
+          <w:lang w:val="en-GB"/>
         </w:rPr>
         <w:drawing>
           <wp:inline distT="0" distB="0" distL="0" distR="0" wp14:anchorId="49B405DA" wp14:editId="17BA0F62">
@@ -73,35 +72,10 @@
         <w:rPr>
           <w:sz w:val="32"/>
           <w:szCs w:val="32"/>
-          <w:lang w:val="sk-SK"/>
+          <w:lang w:val="en-GB"/>
         </w:rPr>
         <w:br/>
-      </w:r>
-      <w:r>
-        <w:rPr>
-          <w:sz w:val="32"/>
-          <w:szCs w:val="32"/>
-          <w:lang w:val="sk-SK"/>
-        </w:rPr>
-        <w:t xml:space="preserve">Softvérové spracovanie </w:t>
-      </w:r>
-      <w:proofErr w:type="spellStart"/>
-      <w:r>
-        <w:rPr>
-          <w:sz w:val="32"/>
-          <w:szCs w:val="32"/>
-          <w:lang w:val="sk-SK"/>
-        </w:rPr>
-        <w:t>biomedicínských</w:t>
-      </w:r>
-      <w:proofErr w:type="spellEnd"/>
-      <w:r>
-        <w:rPr>
-          <w:sz w:val="32"/>
-          <w:szCs w:val="32"/>
-          <w:lang w:val="sk-SK"/>
-        </w:rPr>
-        <w:t xml:space="preserve"> údajov</w:t>
+        <w:t>Softvérové spracovanie biomedicínských údajov</w:t>
       </w:r>
     </w:p>
     <w:p>
@@ -119,7 +93,7 @@
         <w:rPr>
           <w:sz w:val="48"/>
           <w:szCs w:val="52"/>
-          <w:lang w:val="sk-SK"/>
+          <w:lang w:val="en-GB"/>
         </w:rPr>
         <w:alias w:val="Druh práce"/>
         <w:tag w:val="Druh práce"/>
@@ -134,6 +108,11 @@
           <w:listItem w:displayText="Dizertačná práca" w:value="Dizertačná práca"/>
         </w:comboBox>
       </w:sdtPr>
+      <w:sdtEndPr>
+        <w:rPr>
+          <w:szCs w:val="48"/>
+        </w:rPr>
+      </w:sdtEndPr>
       <w:sdtContent>
         <w:p>
           <w:pPr>
@@ -142,52 +121,19 @@
             <w:rPr>
               <w:sz w:val="48"/>
               <w:szCs w:val="52"/>
-              <w:lang w:val="sk-SK"/>
+              <w:lang w:val="en-GB"/>
             </w:rPr>
           </w:pPr>
           <w:r>
             <w:rPr>
               <w:sz w:val="48"/>
               <w:szCs w:val="52"/>
-              <w:lang w:val="sk-SK"/>
+              <w:lang w:val="en-GB"/>
             </w:rPr>
-            <w:t>Semestrálna</w:t>
+            <w:t>Semestrálna Práca - Analýza datasetu</w:t>
           </w:r>
-          <w:r>
-            <w:rPr>
-              <w:sz w:val="48"/>
-              <w:szCs w:val="52"/>
-              <w:lang w:val="sk-SK"/>
-            </w:rPr>
-            <w:t xml:space="preserve"> Práca</w:t>
-          </w:r>
-          <w:r>
-            <w:rPr>
-              <w:sz w:val="48"/>
-              <w:szCs w:val="52"/>
-              <w:lang w:val="sk-SK"/>
-            </w:rPr>
-            <w:t xml:space="preserve"> - Analýza </w:t>
-          </w:r>
-          <w:proofErr w:type="spellStart"/>
-          <w:r>
-            <w:rPr>
-              <w:sz w:val="48"/>
-              <w:szCs w:val="52"/>
-              <w:lang w:val="sk-SK"/>
-            </w:rPr>
-            <w:t>datasetu</w:t>
-          </w:r>
-          <w:proofErr w:type="spellEnd"/>
         </w:p>
       </w:sdtContent>
-      <w:sdtEndPr>
-        <w:rPr>
-          <w:sz w:val="48"/>
-          <w:szCs w:val="48"/>
-          <w:lang w:val="sk-SK"/>
-        </w:rPr>
-      </w:sdtEndPr>
     </w:sdt>
     <w:p>
       <w:pPr>
@@ -203,84 +149,26 @@
           <w:sz w:val="36"/>
           <w:szCs w:val="36"/>
         </w:rPr>
-        <w:t xml:space="preserve">Tímea </w:t>
-      </w:r>
-      <w:proofErr w:type="spellStart"/>
-      <w:r>
+        <w:t>Tímea Petáková, Sarah Zúbeková, Benjamín Vyhnal, Tomáš Socha, Timotej Mahút</w:t>
+      </w:r>
+    </w:p>
+    <w:p>
+      <w:pPr>
+        <w:pStyle w:val="Titlistmeno1"/>
+        <w:spacing w:line="360" w:lineRule="auto"/>
         <w:rPr>
           <w:sz w:val="36"/>
           <w:szCs w:val="36"/>
         </w:rPr>
-        <w:t>Petáková</w:t>
-      </w:r>
-      <w:proofErr w:type="spellEnd"/>
-      <w:r>
-        <w:rPr>
-          <w:sz w:val="36"/>
-          <w:szCs w:val="36"/>
-        </w:rPr>
-        <w:t xml:space="preserve">, </w:t>
-      </w:r>
-      <w:proofErr w:type="spellStart"/>
-      <w:r>
-        <w:rPr>
-          <w:sz w:val="36"/>
-          <w:szCs w:val="36"/>
-        </w:rPr>
-        <w:t>Sarah</w:t>
-      </w:r>
-      <w:proofErr w:type="spellEnd"/>
-      <w:r>
-        <w:rPr>
-          <w:sz w:val="36"/>
-          <w:szCs w:val="36"/>
-        </w:rPr>
-        <w:t xml:space="preserve"> </w:t>
-      </w:r>
-      <w:proofErr w:type="spellStart"/>
-      <w:r>
-        <w:rPr>
-          <w:sz w:val="36"/>
-          <w:szCs w:val="36"/>
-        </w:rPr>
-        <w:t>Zúbeková</w:t>
-      </w:r>
-      <w:proofErr w:type="spellEnd"/>
-      <w:r>
-        <w:rPr>
-          <w:sz w:val="36"/>
-          <w:szCs w:val="36"/>
-        </w:rPr>
-        <w:t xml:space="preserve">, Benjamín Vyhnal, Tomáš Socha, </w:t>
-      </w:r>
-      <w:r>
-        <w:rPr>
-          <w:sz w:val="36"/>
-          <w:szCs w:val="36"/>
-        </w:rPr>
-        <w:t>Timotej Mahút</w:t>
-      </w:r>
+      </w:pPr>
     </w:p>
     <w:p>
       <w:pPr>
-        <w:pStyle w:val="Titlistmeno1"/>
-        <w:spacing w:line="360" w:lineRule="auto"/>
-        <w:rPr>
-          <w:sz w:val="36"/>
-          <w:szCs w:val="36"/>
-        </w:rPr>
-      </w:pPr>
-    </w:p>
-    <w:p>
-      <w:pPr>
         <w:pStyle w:val="Titlistudaje1r"/>
         <w:jc w:val="both"/>
       </w:pPr>
       <w:r>
-        <w:t xml:space="preserve">Študijný program: </w:t>
-      </w:r>
-      <w:r>
-        <w:t>Inžiniersky</w:t>
+        <w:t>Študijný program: Inžiniersky</w:t>
       </w:r>
     </w:p>
     <w:p>
@@ -322,13 +210,7 @@
             <w:rPr>
               <w:rFonts w:cs="Arial"/>
             </w:rPr>
-            <w:t xml:space="preserve">Biomedicínska </w:t>
-          </w:r>
-          <w:r>
-            <w:rPr>
-              <w:rFonts w:cs="Arial"/>
-            </w:rPr>
-            <w:t>Informatika</w:t>
+            <w:t>Biomedicínska Informatika</w:t>
           </w:r>
         </w:sdtContent>
       </w:sdt>
@@ -354,35 +236,7 @@
           <w:b/>
           <w:bCs/>
         </w:rPr>
-        <w:t>Vedúci:</w:t>
-      </w:r>
-      <w:r>
-        <w:rPr>
-          <w:b/>
-          <w:bCs/>
-        </w:rPr>
-        <w:t xml:space="preserve"> doc. Ing</w:t>
-      </w:r>
-      <w:r>
-        <w:rPr>
-          <w:b/>
-          <w:bCs/>
-        </w:rPr>
-        <w:t xml:space="preserve">. </w:t>
-      </w:r>
-      <w:r>
-        <w:rPr>
-          <w:b/>
-          <w:bCs/>
-        </w:rPr>
-        <w:t>Jozef Kostolný</w:t>
-      </w:r>
-      <w:r>
-        <w:rPr>
-          <w:b/>
-          <w:bCs/>
-        </w:rPr>
-        <w:t>, PhD.</w:t>
+        <w:t>Vedúci: doc. Ing. Jozef Kostolný, PhD.</w:t>
       </w:r>
     </w:p>
     <w:p>
@@ -397,14 +251,7 @@
           <w:i/>
           <w:iCs/>
         </w:rPr>
-        <w:t>Žilina, 202</w:t>
-      </w:r>
-      <w:r>
-        <w:rPr>
-          <w:i/>
-          <w:iCs/>
-        </w:rPr>
-        <w:t>6</w:t>
+        <w:t>Žilina, 2026</w:t>
       </w:r>
     </w:p>
     <w:p>
@@ -420,61 +267,34 @@
           <w:sz w:val="36"/>
           <w:szCs w:val="36"/>
         </w:rPr>
-        <w:t xml:space="preserve">Stručný popis </w:t>
+        <w:lastRenderedPageBreak/>
+        <w:t xml:space="preserve">Stručný popis preprocessingu </w:t>
       </w:r>
       <w:r>
         <w:rPr>
           <w:sz w:val="36"/>
           <w:szCs w:val="36"/>
         </w:rPr>
-        <w:t>preprocessingu</w:t>
+        <w:t>dada</w:t>
       </w:r>
       <w:r>
         <w:rPr>
           <w:sz w:val="36"/>
           <w:szCs w:val="36"/>
         </w:rPr>
-        <w:t xml:space="preserve"> </w:t>
+        <w:t>setu</w:t>
       </w:r>
       <w:r>
         <w:rPr>
           <w:sz w:val="36"/>
           <w:szCs w:val="36"/>
         </w:rPr>
-        <w:t>dada</w:t>
-      </w:r>
-      <w:r>
-        <w:rPr>
-          <w:sz w:val="36"/>
-          <w:szCs w:val="36"/>
-        </w:rPr>
-        <w:t>setu</w:t>
-      </w:r>
-      <w:r>
-        <w:rPr>
-          <w:sz w:val="36"/>
-          <w:szCs w:val="36"/>
-        </w:rPr>
         <w:t xml:space="preserve"> pred tvorbou aplikácie</w:t>
       </w:r>
     </w:p>
     <w:p>
       <w:r>
-        <w:t>V tejto časti sme si n</w:t>
-      </w:r>
-      <w:r>
-        <w:t xml:space="preserve">ajskôr pripravili dáta, aby sa s nimi dalo normálne pracovať v </w:t>
-      </w:r>
-      <w:proofErr w:type="spellStart"/>
-      <w:r>
-        <w:t>p</w:t>
-      </w:r>
-      <w:r>
-        <w:t>ythone</w:t>
-      </w:r>
-      <w:proofErr w:type="spellEnd"/>
-      <w:r>
-        <w:t>. Pozreli sme si stĺpce, typy hodnôt a problémové miesta. Potom sme vytvorili jednoduchý skript, ktorý z pôvodného Excelu spraví dva CSV súbory pre ďalšiu prácu.</w:t>
+        <w:t>V tejto časti sme si najskôr pripravili dáta, aby sa s nimi dalo normálne pracovať v pythone. Pozreli sme si stĺpce, typy hodnôt a problémové miesta. Potom sme vytvorili jednoduchý skript, ktorý z pôvodného Excelu spraví dva CSV súbory pre ďalšiu prácu.</w:t>
       </w:r>
     </w:p>
     <w:tbl>
@@ -499,16 +319,10 @@
             <w:vAlign w:val="center"/>
           </w:tcPr>
           <w:p>
-            <w:pPr>
-              <w:rPr>
-                <w:lang w:val="sk-SK"/>
-              </w:rPr>
-            </w:pPr>
             <w:r>
               <w:rPr>
                 <w:color w:val="FFFFFF"/>
                 <w:sz w:val="17"/>
-                <w:lang w:val="sk-SK"/>
               </w:rPr>
               <w:t>Výstupný súbor</w:t>
             </w:r>
@@ -521,16 +335,10 @@
             <w:vAlign w:val="center"/>
           </w:tcPr>
           <w:p>
-            <w:pPr>
-              <w:rPr>
-                <w:lang w:val="sk-SK"/>
-              </w:rPr>
-            </w:pPr>
             <w:r>
               <w:rPr>
                 <w:color w:val="FFFFFF"/>
                 <w:sz w:val="17"/>
-                <w:lang w:val="sk-SK"/>
               </w:rPr>
               <w:t>Na čo slúži</w:t>
             </w:r>
@@ -547,15 +355,9 @@
             <w:vAlign w:val="center"/>
           </w:tcPr>
           <w:p>
-            <w:pPr>
-              <w:rPr>
-                <w:lang w:val="sk-SK"/>
-              </w:rPr>
-            </w:pPr>
-            <w:r>
-              <w:rPr>
-                <w:sz w:val="17"/>
-                <w:lang w:val="sk-SK"/>
+            <w:r>
+              <w:rPr>
+                <w:sz w:val="17"/>
               </w:rPr>
               <w:t>processed_final_dataset.csv</w:t>
             </w:r>
@@ -567,33 +369,11 @@
             <w:vAlign w:val="center"/>
           </w:tcPr>
           <w:p>
-            <w:pPr>
-              <w:rPr>
-                <w:lang w:val="sk-SK"/>
-              </w:rPr>
-            </w:pPr>
-            <w:r>
-              <w:rPr>
-                <w:sz w:val="17"/>
-                <w:lang w:val="sk-SK"/>
-              </w:rPr>
-              <w:t xml:space="preserve">očistené riadky z </w:t>
-            </w:r>
-            <w:proofErr w:type="spellStart"/>
-            <w:r>
-              <w:rPr>
-                <w:sz w:val="17"/>
-                <w:lang w:val="sk-SK"/>
-              </w:rPr>
-              <w:t>datasetu</w:t>
-            </w:r>
-            <w:proofErr w:type="spellEnd"/>
-            <w:r>
-              <w:rPr>
-                <w:sz w:val="17"/>
-                <w:lang w:val="sk-SK"/>
-              </w:rPr>
-              <w:t>, jeden riadok znamená jeden výsledok</w:t>
+            <w:r>
+              <w:rPr>
+                <w:sz w:val="17"/>
+              </w:rPr>
+              <w:t>očistené riadky z datasetu, jeden riadok znamená jeden výsledok</w:t>
             </w:r>
           </w:p>
         </w:tc>
@@ -608,15 +388,9 @@
             <w:vAlign w:val="center"/>
           </w:tcPr>
           <w:p>
-            <w:pPr>
-              <w:rPr>
-                <w:lang w:val="sk-SK"/>
-              </w:rPr>
-            </w:pPr>
-            <w:r>
-              <w:rPr>
-                <w:sz w:val="17"/>
-                <w:lang w:val="sk-SK"/>
+            <w:r>
+              <w:rPr>
+                <w:sz w:val="17"/>
               </w:rPr>
               <w:t>patient_profiles.csv</w:t>
             </w:r>
@@ -628,24 +402,11 @@
             <w:vAlign w:val="center"/>
           </w:tcPr>
           <w:p>
-            <w:pPr>
-              <w:rPr>
-                <w:lang w:val="sk-SK"/>
-              </w:rPr>
-            </w:pPr>
-            <w:r>
-              <w:rPr>
-                <w:sz w:val="17"/>
-                <w:lang w:val="sk-SK"/>
-              </w:rPr>
-              <w:t>prehľad pacientov, jeden riadok znamená jeden profil pacienta</w:t>
-            </w:r>
-            <w:r>
-              <w:rPr>
-                <w:sz w:val="17"/>
-                <w:lang w:val="sk-SK"/>
-              </w:rPr>
-              <w:t xml:space="preserve"> (podľa dátumu narodenia)</w:t>
+            <w:r>
+              <w:rPr>
+                <w:sz w:val="17"/>
+              </w:rPr>
+              <w:t>prehľad pacientov, jeden riadok znamená jeden profil pacienta (podľa dátumu narodenia)</w:t>
             </w:r>
           </w:p>
         </w:tc>
@@ -661,42 +422,13 @@
     </w:p>
     <w:p>
       <w:r>
-        <w:t>Dataset obsahoval laboratórne a genetické výsledky. Jeden pacient sa tam mohol nachádzať veľakrát, lebo mohol mať viac odberov a viac parametrov.</w:t>
-      </w:r>
-      <w:r>
-        <w:t xml:space="preserve"> O</w:t>
-      </w:r>
-      <w:r>
-        <w:t>verovali</w:t>
-      </w:r>
-      <w:r>
-        <w:t xml:space="preserve"> sme si to</w:t>
-      </w:r>
-      <w:r>
-        <w:t xml:space="preserve"> vlastnými výpismi napr. názvy stĺpcov, ukážky hodnôt a počty záznamov. Dataset sme</w:t>
-      </w:r>
-      <w:r>
-        <w:t xml:space="preserve"> následne</w:t>
-      </w:r>
-      <w:r>
-        <w:t xml:space="preserve"> nahrali aj AI, aby nám ho pomohla rýchlo </w:t>
-      </w:r>
-      <w:proofErr w:type="spellStart"/>
-      <w:r>
-        <w:t>štrukt</w:t>
+        <w:t>Dataset obsahoval laboratórne a genetické výsledky. Jeden pacient sa tam mohol nachádzať veľakrát, lebo mohol mať viac odberov a viac parametrov. Overovali sme si to vlastnými výpismi napr. názvy stĺpcov, ukážky hodnôt a počty záznamov. Dataset sme následne nahrali aj AI, aby nám ho pomohla rýchlo štrukt</w:t>
       </w:r>
       <w:r>
         <w:t>u</w:t>
       </w:r>
       <w:r>
-        <w:t>rovať</w:t>
-      </w:r>
-      <w:proofErr w:type="spellEnd"/>
-      <w:r>
-        <w:t xml:space="preserve"> a analyzovať aké možné hodnoty môže stĺpec nadobúdať</w:t>
-      </w:r>
-      <w:r>
-        <w:t xml:space="preserve">. </w:t>
+        <w:t xml:space="preserve">rovať a analyzovať aké možné hodnoty môže stĺpec nadobúdať. </w:t>
       </w:r>
     </w:p>
     <w:tbl>
@@ -718,20 +450,13 @@
           <w:tcPr>
             <w:tcW w:w="5156" w:type="dxa"/>
             <w:shd w:val="clear" w:color="auto" w:fill="1F4E79" w:themeFill="accent5" w:themeFillShade="80"/>
-            <w:tcMar/>
-            <w:vAlign w:val="center"/>
-          </w:tcPr>
-          <w:p>
-            <w:pPr>
-              <w:rPr>
-                <w:lang w:val="sk-SK"/>
-              </w:rPr>
-            </w:pPr>
+            <w:vAlign w:val="center"/>
+          </w:tcPr>
+          <w:p>
             <w:r>
               <w:rPr>
                 <w:color w:val="FFFFFF"/>
                 <w:sz w:val="17"/>
-                <w:lang w:val="sk-SK"/>
               </w:rPr>
               <w:t>Stĺpec</w:t>
             </w:r>
@@ -741,20 +466,13 @@
           <w:tcPr>
             <w:tcW w:w="5156" w:type="dxa"/>
             <w:shd w:val="clear" w:color="auto" w:fill="1F4E79" w:themeFill="accent5" w:themeFillShade="80"/>
-            <w:tcMar/>
-            <w:vAlign w:val="center"/>
-          </w:tcPr>
-          <w:p>
-            <w:pPr>
-              <w:rPr>
-                <w:lang w:val="sk-SK"/>
-              </w:rPr>
-            </w:pPr>
+            <w:vAlign w:val="center"/>
+          </w:tcPr>
+          <w:p>
             <w:r>
               <w:rPr>
                 <w:color w:val="FFFFFF"/>
                 <w:sz w:val="17"/>
-                <w:lang w:val="sk-SK"/>
               </w:rPr>
               <w:t>Čo v ňom bolo</w:t>
             </w:r>
@@ -768,42 +486,26 @@
         <w:tc>
           <w:tcPr>
             <w:tcW w:w="5156" w:type="dxa"/>
-            <w:tcMar/>
-            <w:vAlign w:val="center"/>
-          </w:tcPr>
-          <w:p>
-            <w:pPr>
-              <w:rPr>
-                <w:lang w:val="sk-SK"/>
-              </w:rPr>
-            </w:pPr>
-            <w:proofErr w:type="spellStart"/>
-            <w:r>
-              <w:rPr>
-                <w:sz w:val="17"/>
-                <w:lang w:val="sk-SK"/>
+            <w:vAlign w:val="center"/>
+          </w:tcPr>
+          <w:p>
+            <w:r>
+              <w:rPr>
+                <w:sz w:val="17"/>
               </w:rPr>
               <w:t>Cislo_Z</w:t>
             </w:r>
-            <w:proofErr w:type="spellEnd"/>
-          </w:p>
-        </w:tc>
-        <w:tc>
-          <w:tcPr>
-            <w:tcW w:w="5156" w:type="dxa"/>
-            <w:tcMar/>
-            <w:vAlign w:val="center"/>
-          </w:tcPr>
-          <w:p>
-            <w:pPr>
-              <w:rPr>
-                <w:lang w:val="sk-SK"/>
-              </w:rPr>
-            </w:pPr>
-            <w:r>
-              <w:rPr>
-                <w:sz w:val="17"/>
-                <w:lang w:val="sk-SK"/>
+          </w:p>
+        </w:tc>
+        <w:tc>
+          <w:tcPr>
+            <w:tcW w:w="5156" w:type="dxa"/>
+            <w:vAlign w:val="center"/>
+          </w:tcPr>
+          <w:p>
+            <w:r>
+              <w:rPr>
+                <w:sz w:val="17"/>
               </w:rPr>
               <w:t>číslo záznamu alebo vyšetrenia, nie pacient</w:t>
             </w:r>
@@ -817,42 +519,26 @@
         <w:tc>
           <w:tcPr>
             <w:tcW w:w="5156" w:type="dxa"/>
-            <w:tcMar/>
-            <w:vAlign w:val="center"/>
-          </w:tcPr>
-          <w:p>
-            <w:pPr>
-              <w:rPr>
-                <w:lang w:val="sk-SK"/>
-              </w:rPr>
-            </w:pPr>
-            <w:proofErr w:type="spellStart"/>
-            <w:r>
-              <w:rPr>
-                <w:sz w:val="17"/>
-                <w:lang w:val="sk-SK"/>
+            <w:vAlign w:val="center"/>
+          </w:tcPr>
+          <w:p>
+            <w:r>
+              <w:rPr>
+                <w:sz w:val="17"/>
               </w:rPr>
               <w:t>Datum_O</w:t>
             </w:r>
-            <w:proofErr w:type="spellEnd"/>
-          </w:p>
-        </w:tc>
-        <w:tc>
-          <w:tcPr>
-            <w:tcW w:w="5156" w:type="dxa"/>
-            <w:tcMar/>
-            <w:vAlign w:val="center"/>
-          </w:tcPr>
-          <w:p>
-            <w:pPr>
-              <w:rPr>
-                <w:lang w:val="sk-SK"/>
-              </w:rPr>
-            </w:pPr>
-            <w:r>
-              <w:rPr>
-                <w:sz w:val="17"/>
-                <w:lang w:val="sk-SK"/>
+          </w:p>
+        </w:tc>
+        <w:tc>
+          <w:tcPr>
+            <w:tcW w:w="5156" w:type="dxa"/>
+            <w:vAlign w:val="center"/>
+          </w:tcPr>
+          <w:p>
+            <w:r>
+              <w:rPr>
+                <w:sz w:val="17"/>
               </w:rPr>
               <w:t>dátum odberu, niekedy v inom formáte</w:t>
             </w:r>
@@ -866,42 +552,26 @@
         <w:tc>
           <w:tcPr>
             <w:tcW w:w="5156" w:type="dxa"/>
-            <w:tcMar/>
-            <w:vAlign w:val="center"/>
-          </w:tcPr>
-          <w:p>
-            <w:pPr>
-              <w:rPr>
-                <w:lang w:val="sk-SK"/>
-              </w:rPr>
-            </w:pPr>
-            <w:proofErr w:type="spellStart"/>
-            <w:r>
-              <w:rPr>
-                <w:sz w:val="17"/>
-                <w:lang w:val="sk-SK"/>
+            <w:vAlign w:val="center"/>
+          </w:tcPr>
+          <w:p>
+            <w:r>
+              <w:rPr>
+                <w:sz w:val="17"/>
               </w:rPr>
               <w:t>Datum_Nar</w:t>
             </w:r>
-            <w:proofErr w:type="spellEnd"/>
-          </w:p>
-        </w:tc>
-        <w:tc>
-          <w:tcPr>
-            <w:tcW w:w="5156" w:type="dxa"/>
-            <w:tcMar/>
-            <w:vAlign w:val="center"/>
-          </w:tcPr>
-          <w:p>
-            <w:pPr>
-              <w:rPr>
-                <w:lang w:val="sk-SK"/>
-              </w:rPr>
-            </w:pPr>
-            <w:r>
-              <w:rPr>
-                <w:sz w:val="17"/>
-                <w:lang w:val="sk-SK"/>
+          </w:p>
+        </w:tc>
+        <w:tc>
+          <w:tcPr>
+            <w:tcW w:w="5156" w:type="dxa"/>
+            <w:vAlign w:val="center"/>
+          </w:tcPr>
+          <w:p>
+            <w:r>
+              <w:rPr>
+                <w:sz w:val="17"/>
               </w:rPr>
               <w:t>fiktívny dátum narodenia, podľa neho sme spájali pacienta</w:t>
             </w:r>
@@ -915,19 +585,12 @@
         <w:tc>
           <w:tcPr>
             <w:tcW w:w="5156" w:type="dxa"/>
-            <w:tcMar/>
-            <w:vAlign w:val="center"/>
-          </w:tcPr>
-          <w:p>
-            <w:pPr>
-              <w:rPr>
-                <w:lang w:val="sk-SK"/>
-              </w:rPr>
-            </w:pPr>
-            <w:r>
-              <w:rPr>
-                <w:sz w:val="17"/>
-                <w:lang w:val="sk-SK"/>
+            <w:vAlign w:val="center"/>
+          </w:tcPr>
+          <w:p>
+            <w:r>
+              <w:rPr>
+                <w:sz w:val="17"/>
               </w:rPr>
               <w:t>Pohlavie</w:t>
             </w:r>
@@ -936,19 +599,12 @@
         <w:tc>
           <w:tcPr>
             <w:tcW w:w="5156" w:type="dxa"/>
-            <w:tcMar/>
-            <w:vAlign w:val="center"/>
-          </w:tcPr>
-          <w:p>
-            <w:pPr>
-              <w:rPr>
-                <w:lang w:val="sk-SK"/>
-              </w:rPr>
-            </w:pPr>
-            <w:r>
-              <w:rPr>
-                <w:sz w:val="17"/>
-                <w:lang w:val="sk-SK"/>
+            <w:vAlign w:val="center"/>
+          </w:tcPr>
+          <w:p>
+            <w:r>
+              <w:rPr>
+                <w:sz w:val="17"/>
               </w:rPr>
               <w:t>M alebo F, miestami sa mohli vyskytnúť nezhody</w:t>
             </w:r>
@@ -962,42 +618,26 @@
         <w:tc>
           <w:tcPr>
             <w:tcW w:w="5156" w:type="dxa"/>
-            <w:tcMar/>
-            <w:vAlign w:val="center"/>
-          </w:tcPr>
-          <w:p>
-            <w:pPr>
-              <w:rPr>
-                <w:lang w:val="sk-SK"/>
-              </w:rPr>
-            </w:pPr>
-            <w:proofErr w:type="spellStart"/>
-            <w:r>
-              <w:rPr>
-                <w:sz w:val="17"/>
-                <w:lang w:val="sk-SK"/>
+            <w:vAlign w:val="center"/>
+          </w:tcPr>
+          <w:p>
+            <w:r>
+              <w:rPr>
+                <w:sz w:val="17"/>
               </w:rPr>
               <w:t>Lab_Nazov</w:t>
             </w:r>
-            <w:proofErr w:type="spellEnd"/>
-          </w:p>
-        </w:tc>
-        <w:tc>
-          <w:tcPr>
-            <w:tcW w:w="5156" w:type="dxa"/>
-            <w:tcMar/>
-            <w:vAlign w:val="center"/>
-          </w:tcPr>
-          <w:p>
-            <w:pPr>
-              <w:rPr>
-                <w:lang w:val="sk-SK"/>
-              </w:rPr>
-            </w:pPr>
-            <w:r>
-              <w:rPr>
-                <w:sz w:val="17"/>
-                <w:lang w:val="sk-SK"/>
+          </w:p>
+        </w:tc>
+        <w:tc>
+          <w:tcPr>
+            <w:tcW w:w="5156" w:type="dxa"/>
+            <w:vAlign w:val="center"/>
+          </w:tcPr>
+          <w:p>
+            <w:r>
+              <w:rPr>
+                <w:sz w:val="17"/>
               </w:rPr>
               <w:t>názov laboratórneho alebo genetického vyšetrenia</w:t>
             </w:r>
@@ -1011,42 +651,26 @@
         <w:tc>
           <w:tcPr>
             <w:tcW w:w="5156" w:type="dxa"/>
-            <w:tcMar/>
-            <w:vAlign w:val="center"/>
-          </w:tcPr>
-          <w:p>
-            <w:pPr>
-              <w:rPr>
-                <w:lang w:val="sk-SK"/>
-              </w:rPr>
-            </w:pPr>
-            <w:proofErr w:type="spellStart"/>
-            <w:r>
-              <w:rPr>
-                <w:sz w:val="17"/>
-                <w:lang w:val="sk-SK"/>
+            <w:vAlign w:val="center"/>
+          </w:tcPr>
+          <w:p>
+            <w:r>
+              <w:rPr>
+                <w:sz w:val="17"/>
               </w:rPr>
               <w:t>Vysl_Value</w:t>
             </w:r>
-            <w:proofErr w:type="spellEnd"/>
-          </w:p>
-        </w:tc>
-        <w:tc>
-          <w:tcPr>
-            <w:tcW w:w="5156" w:type="dxa"/>
-            <w:tcMar/>
-            <w:vAlign w:val="center"/>
-          </w:tcPr>
-          <w:p>
-            <w:pPr>
-              <w:rPr>
-                <w:lang w:val="sk-SK"/>
-              </w:rPr>
-            </w:pPr>
-            <w:r>
-              <w:rPr>
-                <w:sz w:val="17"/>
-                <w:lang w:val="sk-SK"/>
+          </w:p>
+        </w:tc>
+        <w:tc>
+          <w:tcPr>
+            <w:tcW w:w="5156" w:type="dxa"/>
+            <w:vAlign w:val="center"/>
+          </w:tcPr>
+          <w:p>
+            <w:r>
+              <w:rPr>
+                <w:sz w:val="17"/>
               </w:rPr>
               <w:t>samotný výsledok, číslo, text alebo genetický nález</w:t>
             </w:r>
@@ -1059,14 +683,11 @@
         <w:pStyle w:val="Nadpis1"/>
       </w:pPr>
       <w:r>
-        <w:rPr/>
         <w:t>Štatistiky jednotlivých záznamov v pôvodnom datasete</w:t>
       </w:r>
     </w:p>
     <w:tbl>
       <w:tblPr>
-        <w:tblStyle w:val="Normlnatabuka"/>
-        <w:bidiVisual w:val="0"/>
         <w:tblW w:w="0" w:type="auto"/>
         <w:tblLook w:val="06A0" w:firstRow="1" w:lastRow="0" w:firstColumn="1" w:lastColumn="0" w:noHBand="1" w:noVBand="1"/>
       </w:tblPr>
@@ -1082,10 +703,10 @@
           <w:tcPr>
             <w:tcW w:w="5074" w:type="dxa"/>
             <w:tcBorders>
-              <w:top w:val="single" w:sz="6"/>
-              <w:left w:val="single" w:sz="6"/>
-              <w:bottom w:val="single" w:sz="6"/>
-              <w:right w:val="single" w:sz="6"/>
+              <w:top w:val="single" w:sz="6" w:space="0" w:color="auto"/>
+              <w:left w:val="single" w:sz="6" w:space="0" w:color="auto"/>
+              <w:bottom w:val="single" w:sz="6" w:space="0" w:color="auto"/>
+              <w:right w:val="single" w:sz="6" w:space="0" w:color="auto"/>
             </w:tcBorders>
             <w:shd w:val="clear" w:color="auto" w:fill="EFEFEF"/>
             <w:tcMar>
@@ -1097,17 +718,17 @@
           </w:tcPr>
           <w:p>
             <w:pPr>
-              <w:spacing w:before="0" w:beforeAutospacing="off" w:after="0" w:afterAutospacing="off"/>
-              <w:rPr>
-                <w:b w:val="1"/>
-                <w:bCs w:val="1"/>
+              <w:spacing w:before="0"/>
+              <w:rPr>
+                <w:b/>
+                <w:bCs/>
                 <w:color w:val="1F1F1F"/>
               </w:rPr>
             </w:pPr>
             <w:r>
               <w:rPr>
-                <w:b w:val="1"/>
-                <w:bCs w:val="1"/>
+                <w:b/>
+                <w:bCs/>
                 <w:color w:val="1F1F1F"/>
               </w:rPr>
               <w:t>Položka</w:t>
@@ -1118,10 +739,10 @@
           <w:tcPr>
             <w:tcW w:w="3360" w:type="dxa"/>
             <w:tcBorders>
-              <w:top w:val="single" w:sz="6"/>
-              <w:left w:val="single" w:sz="6"/>
-              <w:bottom w:val="single" w:sz="6"/>
-              <w:right w:val="single" w:sz="6"/>
+              <w:top w:val="single" w:sz="6" w:space="0" w:color="auto"/>
+              <w:left w:val="single" w:sz="6" w:space="0" w:color="auto"/>
+              <w:bottom w:val="single" w:sz="6" w:space="0" w:color="auto"/>
+              <w:right w:val="single" w:sz="6" w:space="0" w:color="auto"/>
             </w:tcBorders>
             <w:shd w:val="clear" w:color="auto" w:fill="EFEFEF"/>
             <w:tcMar>
@@ -1132,17 +753,17 @@
           </w:tcPr>
           <w:p>
             <w:pPr>
-              <w:spacing w:before="0" w:beforeAutospacing="off" w:after="0" w:afterAutospacing="off"/>
-              <w:rPr>
-                <w:b w:val="1"/>
-                <w:bCs w:val="1"/>
+              <w:spacing w:before="0"/>
+              <w:rPr>
+                <w:b/>
+                <w:bCs/>
                 <w:color w:val="1F1F1F"/>
               </w:rPr>
             </w:pPr>
             <w:r>
               <w:rPr>
-                <w:b w:val="1"/>
-                <w:bCs w:val="1"/>
+                <w:b/>
+                <w:bCs/>
                 <w:color w:val="1F1F1F"/>
               </w:rPr>
               <w:t>Hodnota</w:t>
@@ -1158,10 +779,10 @@
           <w:tcPr>
             <w:tcW w:w="5074" w:type="dxa"/>
             <w:tcBorders>
-              <w:top w:val="single" w:sz="6"/>
-              <w:left w:val="single" w:sz="6"/>
-              <w:bottom w:val="single" w:sz="6"/>
-              <w:right w:val="single" w:sz="6"/>
+              <w:top w:val="single" w:sz="6" w:space="0" w:color="auto"/>
+              <w:left w:val="single" w:sz="6" w:space="0" w:color="auto"/>
+              <w:bottom w:val="single" w:sz="6" w:space="0" w:color="auto"/>
+              <w:right w:val="single" w:sz="6" w:space="0" w:color="auto"/>
             </w:tcBorders>
             <w:tcMar>
               <w:top w:w="240" w:type="dxa"/>
@@ -1172,17 +793,13 @@
           </w:tcPr>
           <w:p>
             <w:pPr>
-              <w:spacing w:before="0" w:beforeAutospacing="off" w:after="0" w:afterAutospacing="off"/>
-              <w:rPr>
-                <w:b w:val="0"/>
-                <w:bCs w:val="0"/>
+              <w:spacing w:before="0"/>
+              <w:rPr>
                 <w:color w:val="1F1F1F"/>
               </w:rPr>
             </w:pPr>
             <w:r>
               <w:rPr>
-                <w:b w:val="0"/>
-                <w:bCs w:val="0"/>
                 <w:color w:val="1F1F1F"/>
               </w:rPr>
               <w:t>Počet riadkov bez hlavičky</w:t>
@@ -1193,10 +810,10 @@
           <w:tcPr>
             <w:tcW w:w="3360" w:type="dxa"/>
             <w:tcBorders>
-              <w:top w:val="single" w:sz="6"/>
-              <w:left w:val="single" w:sz="6"/>
-              <w:bottom w:val="single" w:sz="6"/>
-              <w:right w:val="single" w:sz="6"/>
+              <w:top w:val="single" w:sz="6" w:space="0" w:color="auto"/>
+              <w:left w:val="single" w:sz="6" w:space="0" w:color="auto"/>
+              <w:bottom w:val="single" w:sz="6" w:space="0" w:color="auto"/>
+              <w:right w:val="single" w:sz="6" w:space="0" w:color="auto"/>
             </w:tcBorders>
             <w:tcMar>
               <w:top w:w="240" w:type="dxa"/>
@@ -1206,17 +823,13 @@
           </w:tcPr>
           <w:p>
             <w:pPr>
-              <w:spacing w:before="0" w:beforeAutospacing="off" w:after="0" w:afterAutospacing="off"/>
-              <w:rPr>
-                <w:b w:val="0"/>
-                <w:bCs w:val="0"/>
+              <w:spacing w:before="0"/>
+              <w:rPr>
                 <w:color w:val="1F1F1F"/>
               </w:rPr>
             </w:pPr>
             <w:r>
               <w:rPr>
-                <w:b w:val="0"/>
-                <w:bCs w:val="0"/>
                 <w:color w:val="1F1F1F"/>
               </w:rPr>
               <w:t>423 671</w:t>
@@ -1232,10 +845,10 @@
           <w:tcPr>
             <w:tcW w:w="5074" w:type="dxa"/>
             <w:tcBorders>
-              <w:top w:val="single" w:sz="6"/>
-              <w:left w:val="single" w:sz="6"/>
-              <w:bottom w:val="single" w:sz="6"/>
-              <w:right w:val="single" w:sz="6"/>
+              <w:top w:val="single" w:sz="6" w:space="0" w:color="auto"/>
+              <w:left w:val="single" w:sz="6" w:space="0" w:color="auto"/>
+              <w:bottom w:val="single" w:sz="6" w:space="0" w:color="auto"/>
+              <w:right w:val="single" w:sz="6" w:space="0" w:color="auto"/>
             </w:tcBorders>
             <w:tcMar>
               <w:top w:w="240" w:type="dxa"/>
@@ -1246,17 +859,13 @@
           </w:tcPr>
           <w:p>
             <w:pPr>
-              <w:spacing w:before="0" w:beforeAutospacing="off" w:after="0" w:afterAutospacing="off"/>
-              <w:rPr>
-                <w:b w:val="0"/>
-                <w:bCs w:val="0"/>
+              <w:spacing w:before="0"/>
+              <w:rPr>
                 <w:color w:val="1F1F1F"/>
               </w:rPr>
             </w:pPr>
             <w:r>
               <w:rPr>
-                <w:b w:val="0"/>
-                <w:bCs w:val="0"/>
                 <w:color w:val="1F1F1F"/>
               </w:rPr>
               <w:t>Počet stĺpcov</w:t>
@@ -1267,10 +876,10 @@
           <w:tcPr>
             <w:tcW w:w="3360" w:type="dxa"/>
             <w:tcBorders>
-              <w:top w:val="single" w:sz="6"/>
-              <w:left w:val="single" w:sz="6"/>
-              <w:bottom w:val="single" w:sz="6"/>
-              <w:right w:val="single" w:sz="6"/>
+              <w:top w:val="single" w:sz="6" w:space="0" w:color="auto"/>
+              <w:left w:val="single" w:sz="6" w:space="0" w:color="auto"/>
+              <w:bottom w:val="single" w:sz="6" w:space="0" w:color="auto"/>
+              <w:right w:val="single" w:sz="6" w:space="0" w:color="auto"/>
             </w:tcBorders>
             <w:tcMar>
               <w:top w:w="240" w:type="dxa"/>
@@ -1280,17 +889,13 @@
           </w:tcPr>
           <w:p>
             <w:pPr>
-              <w:spacing w:before="0" w:beforeAutospacing="off" w:after="0" w:afterAutospacing="off"/>
-              <w:rPr>
-                <w:b w:val="0"/>
-                <w:bCs w:val="0"/>
+              <w:spacing w:before="0"/>
+              <w:rPr>
                 <w:color w:val="1F1F1F"/>
               </w:rPr>
             </w:pPr>
             <w:r>
               <w:rPr>
-                <w:b w:val="0"/>
-                <w:bCs w:val="0"/>
                 <w:color w:val="1F1F1F"/>
               </w:rPr>
               <w:t>8</w:t>
@@ -1306,10 +911,10 @@
           <w:tcPr>
             <w:tcW w:w="5074" w:type="dxa"/>
             <w:tcBorders>
-              <w:top w:val="single" w:sz="6"/>
-              <w:left w:val="single" w:sz="6"/>
-              <w:bottom w:val="single" w:sz="6"/>
-              <w:right w:val="single" w:sz="6"/>
+              <w:top w:val="single" w:sz="6" w:space="0" w:color="auto"/>
+              <w:left w:val="single" w:sz="6" w:space="0" w:color="auto"/>
+              <w:bottom w:val="single" w:sz="6" w:space="0" w:color="auto"/>
+              <w:right w:val="single" w:sz="6" w:space="0" w:color="auto"/>
             </w:tcBorders>
             <w:tcMar>
               <w:top w:w="240" w:type="dxa"/>
@@ -1320,19 +925,16 @@
           </w:tcPr>
           <w:p>
             <w:pPr>
-              <w:spacing w:before="0" w:beforeAutospacing="off" w:after="0" w:afterAutospacing="off"/>
-              <w:rPr>
-                <w:b w:val="0"/>
-                <w:bCs w:val="0"/>
+              <w:spacing w:before="0"/>
+              <w:rPr>
                 <w:color w:val="1F1F1F"/>
               </w:rPr>
             </w:pPr>
             <w:r>
               <w:rPr>
-                <w:b w:val="0"/>
-                <w:bCs w:val="0"/>
                 <w:color w:val="1F1F1F"/>
               </w:rPr>
+              <w:lastRenderedPageBreak/>
               <w:t>Počet unikátnych laboratórnych názvov</w:t>
             </w:r>
           </w:p>
@@ -1341,10 +943,10 @@
           <w:tcPr>
             <w:tcW w:w="3360" w:type="dxa"/>
             <w:tcBorders>
-              <w:top w:val="single" w:sz="6"/>
-              <w:left w:val="single" w:sz="6"/>
-              <w:bottom w:val="single" w:sz="6"/>
-              <w:right w:val="single" w:sz="6"/>
+              <w:top w:val="single" w:sz="6" w:space="0" w:color="auto"/>
+              <w:left w:val="single" w:sz="6" w:space="0" w:color="auto"/>
+              <w:bottom w:val="single" w:sz="6" w:space="0" w:color="auto"/>
+              <w:right w:val="single" w:sz="6" w:space="0" w:color="auto"/>
             </w:tcBorders>
             <w:tcMar>
               <w:top w:w="240" w:type="dxa"/>
@@ -1354,17 +956,13 @@
           </w:tcPr>
           <w:p>
             <w:pPr>
-              <w:spacing w:before="0" w:beforeAutospacing="off" w:after="0" w:afterAutospacing="off"/>
-              <w:rPr>
-                <w:b w:val="0"/>
-                <w:bCs w:val="0"/>
+              <w:spacing w:before="0"/>
+              <w:rPr>
                 <w:color w:val="1F1F1F"/>
               </w:rPr>
             </w:pPr>
             <w:r>
               <w:rPr>
-                <w:b w:val="0"/>
-                <w:bCs w:val="0"/>
                 <w:color w:val="1F1F1F"/>
               </w:rPr>
               <w:t>790</w:t>
@@ -1380,10 +978,10 @@
           <w:tcPr>
             <w:tcW w:w="5074" w:type="dxa"/>
             <w:tcBorders>
-              <w:top w:val="single" w:sz="6"/>
-              <w:left w:val="single" w:sz="6"/>
-              <w:bottom w:val="single" w:sz="6"/>
-              <w:right w:val="single" w:sz="6"/>
+              <w:top w:val="single" w:sz="6" w:space="0" w:color="auto"/>
+              <w:left w:val="single" w:sz="6" w:space="0" w:color="auto"/>
+              <w:bottom w:val="single" w:sz="6" w:space="0" w:color="auto"/>
+              <w:right w:val="single" w:sz="6" w:space="0" w:color="auto"/>
             </w:tcBorders>
             <w:tcMar>
               <w:top w:w="240" w:type="dxa"/>
@@ -1394,17 +992,13 @@
           </w:tcPr>
           <w:p>
             <w:pPr>
-              <w:spacing w:before="0" w:beforeAutospacing="off" w:after="0" w:afterAutospacing="off"/>
-              <w:rPr>
-                <w:b w:val="0"/>
-                <w:bCs w:val="0"/>
+              <w:spacing w:before="0"/>
+              <w:rPr>
                 <w:color w:val="1F1F1F"/>
               </w:rPr>
             </w:pPr>
             <w:r>
               <w:rPr>
-                <w:b w:val="0"/>
-                <w:bCs w:val="0"/>
                 <w:color w:val="1F1F1F"/>
               </w:rPr>
               <w:t>Počet unikátnych vyšetrení podľa Cislo_Z</w:t>
@@ -1415,10 +1009,10 @@
           <w:tcPr>
             <w:tcW w:w="3360" w:type="dxa"/>
             <w:tcBorders>
-              <w:top w:val="single" w:sz="6"/>
-              <w:left w:val="single" w:sz="6"/>
-              <w:bottom w:val="single" w:sz="6"/>
-              <w:right w:val="single" w:sz="6"/>
+              <w:top w:val="single" w:sz="6" w:space="0" w:color="auto"/>
+              <w:left w:val="single" w:sz="6" w:space="0" w:color="auto"/>
+              <w:bottom w:val="single" w:sz="6" w:space="0" w:color="auto"/>
+              <w:right w:val="single" w:sz="6" w:space="0" w:color="auto"/>
             </w:tcBorders>
             <w:tcMar>
               <w:top w:w="240" w:type="dxa"/>
@@ -1428,17 +1022,13 @@
           </w:tcPr>
           <w:p>
             <w:pPr>
-              <w:spacing w:before="0" w:beforeAutospacing="off" w:after="0" w:afterAutospacing="off"/>
-              <w:rPr>
-                <w:b w:val="0"/>
-                <w:bCs w:val="0"/>
+              <w:spacing w:before="0"/>
+              <w:rPr>
                 <w:color w:val="1F1F1F"/>
               </w:rPr>
             </w:pPr>
             <w:r>
               <w:rPr>
-                <w:b w:val="0"/>
-                <w:bCs w:val="0"/>
                 <w:color w:val="1F1F1F"/>
               </w:rPr>
               <w:t>31 943</w:t>
@@ -1454,10 +1044,10 @@
           <w:tcPr>
             <w:tcW w:w="5074" w:type="dxa"/>
             <w:tcBorders>
-              <w:top w:val="single" w:sz="6"/>
-              <w:left w:val="single" w:sz="6"/>
-              <w:bottom w:val="single" w:sz="6"/>
-              <w:right w:val="single" w:sz="6"/>
+              <w:top w:val="single" w:sz="6" w:space="0" w:color="auto"/>
+              <w:left w:val="single" w:sz="6" w:space="0" w:color="auto"/>
+              <w:bottom w:val="single" w:sz="6" w:space="0" w:color="auto"/>
+              <w:right w:val="single" w:sz="6" w:space="0" w:color="auto"/>
             </w:tcBorders>
             <w:tcMar>
               <w:top w:w="240" w:type="dxa"/>
@@ -1468,17 +1058,13 @@
           </w:tcPr>
           <w:p>
             <w:pPr>
-              <w:spacing w:before="0" w:beforeAutospacing="off" w:after="0" w:afterAutospacing="off"/>
-              <w:rPr>
-                <w:b w:val="0"/>
-                <w:bCs w:val="0"/>
+              <w:spacing w:before="0"/>
+              <w:rPr>
                 <w:color w:val="1F1F1F"/>
               </w:rPr>
             </w:pPr>
             <w:r>
               <w:rPr>
-                <w:b w:val="0"/>
-                <w:bCs w:val="0"/>
                 <w:color w:val="1F1F1F"/>
               </w:rPr>
               <w:t>Počet pacientov podľa Datum_Nar</w:t>
@@ -1489,10 +1075,10 @@
           <w:tcPr>
             <w:tcW w:w="3360" w:type="dxa"/>
             <w:tcBorders>
-              <w:top w:val="single" w:sz="6"/>
-              <w:left w:val="single" w:sz="6"/>
-              <w:bottom w:val="single" w:sz="6"/>
-              <w:right w:val="single" w:sz="6"/>
+              <w:top w:val="single" w:sz="6" w:space="0" w:color="auto"/>
+              <w:left w:val="single" w:sz="6" w:space="0" w:color="auto"/>
+              <w:bottom w:val="single" w:sz="6" w:space="0" w:color="auto"/>
+              <w:right w:val="single" w:sz="6" w:space="0" w:color="auto"/>
             </w:tcBorders>
             <w:tcMar>
               <w:top w:w="240" w:type="dxa"/>
@@ -1502,17 +1088,13 @@
           </w:tcPr>
           <w:p>
             <w:pPr>
-              <w:spacing w:before="0" w:beforeAutospacing="off" w:after="0" w:afterAutospacing="off"/>
-              <w:rPr>
-                <w:b w:val="0"/>
-                <w:bCs w:val="0"/>
+              <w:spacing w:before="0"/>
+              <w:rPr>
                 <w:color w:val="1F1F1F"/>
               </w:rPr>
             </w:pPr>
             <w:r>
               <w:rPr>
-                <w:b w:val="0"/>
-                <w:bCs w:val="0"/>
                 <w:color w:val="1F1F1F"/>
               </w:rPr>
               <w:t>3 244</w:t>
@@ -1528,10 +1110,10 @@
           <w:tcPr>
             <w:tcW w:w="5074" w:type="dxa"/>
             <w:tcBorders>
-              <w:top w:val="single" w:sz="6"/>
-              <w:left w:val="single" w:sz="6"/>
-              <w:bottom w:val="single" w:sz="6"/>
-              <w:right w:val="single" w:sz="6"/>
+              <w:top w:val="single" w:sz="6" w:space="0" w:color="auto"/>
+              <w:left w:val="single" w:sz="6" w:space="0" w:color="auto"/>
+              <w:bottom w:val="single" w:sz="6" w:space="0" w:color="auto"/>
+              <w:right w:val="single" w:sz="6" w:space="0" w:color="auto"/>
             </w:tcBorders>
             <w:tcMar>
               <w:top w:w="240" w:type="dxa"/>
@@ -1542,17 +1124,13 @@
           </w:tcPr>
           <w:p>
             <w:pPr>
-              <w:spacing w:before="0" w:beforeAutospacing="off" w:after="0" w:afterAutospacing="off"/>
-              <w:rPr>
-                <w:b w:val="0"/>
-                <w:bCs w:val="0"/>
+              <w:spacing w:before="0"/>
+              <w:rPr>
                 <w:color w:val="1F1F1F"/>
               </w:rPr>
             </w:pPr>
             <w:r>
               <w:rPr>
-                <w:b w:val="0"/>
-                <w:bCs w:val="0"/>
                 <w:color w:val="1F1F1F"/>
               </w:rPr>
               <w:t>Dátumy vyšetrení</w:t>
@@ -1563,10 +1141,10 @@
           <w:tcPr>
             <w:tcW w:w="3360" w:type="dxa"/>
             <w:tcBorders>
-              <w:top w:val="single" w:sz="6"/>
-              <w:left w:val="single" w:sz="6"/>
-              <w:bottom w:val="single" w:sz="6"/>
-              <w:right w:val="single" w:sz="6"/>
+              <w:top w:val="single" w:sz="6" w:space="0" w:color="auto"/>
+              <w:left w:val="single" w:sz="6" w:space="0" w:color="auto"/>
+              <w:bottom w:val="single" w:sz="6" w:space="0" w:color="auto"/>
+              <w:right w:val="single" w:sz="6" w:space="0" w:color="auto"/>
             </w:tcBorders>
             <w:tcMar>
               <w:top w:w="240" w:type="dxa"/>
@@ -1576,17 +1154,13 @@
           </w:tcPr>
           <w:p>
             <w:pPr>
-              <w:spacing w:before="0" w:beforeAutospacing="off" w:after="0" w:afterAutospacing="off"/>
-              <w:rPr>
-                <w:b w:val="0"/>
-                <w:bCs w:val="0"/>
+              <w:spacing w:before="0"/>
+              <w:rPr>
                 <w:color w:val="1F1F1F"/>
               </w:rPr>
             </w:pPr>
             <w:r>
               <w:rPr>
-                <w:b w:val="0"/>
-                <w:bCs w:val="0"/>
                 <w:color w:val="1F1F1F"/>
               </w:rPr>
               <w:t>od 2010-01-03 do 2022-12-29</w:t>
@@ -1602,10 +1176,10 @@
           <w:tcPr>
             <w:tcW w:w="5074" w:type="dxa"/>
             <w:tcBorders>
-              <w:top w:val="single" w:sz="6"/>
-              <w:left w:val="single" w:sz="6"/>
-              <w:bottom w:val="single" w:sz="6"/>
-              <w:right w:val="single" w:sz="6"/>
+              <w:top w:val="single" w:sz="6" w:space="0" w:color="auto"/>
+              <w:left w:val="single" w:sz="6" w:space="0" w:color="auto"/>
+              <w:bottom w:val="single" w:sz="6" w:space="0" w:color="auto"/>
+              <w:right w:val="single" w:sz="6" w:space="0" w:color="auto"/>
             </w:tcBorders>
             <w:tcMar>
               <w:top w:w="240" w:type="dxa"/>
@@ -1616,17 +1190,13 @@
           </w:tcPr>
           <w:p>
             <w:pPr>
-              <w:spacing w:before="0" w:beforeAutospacing="off" w:after="0" w:afterAutospacing="off"/>
-              <w:rPr>
-                <w:b w:val="0"/>
-                <w:bCs w:val="0"/>
+              <w:spacing w:before="0"/>
+              <w:rPr>
                 <w:color w:val="1F1F1F"/>
               </w:rPr>
             </w:pPr>
             <w:r>
               <w:rPr>
-                <w:b w:val="0"/>
-                <w:bCs w:val="0"/>
                 <w:color w:val="1F1F1F"/>
               </w:rPr>
               <w:t>Chýbajúce hodnoty vo Vysl_Value</w:t>
@@ -1637,10 +1207,10 @@
           <w:tcPr>
             <w:tcW w:w="3360" w:type="dxa"/>
             <w:tcBorders>
-              <w:top w:val="single" w:sz="6"/>
-              <w:left w:val="single" w:sz="6"/>
-              <w:bottom w:val="single" w:sz="6"/>
-              <w:right w:val="single" w:sz="6"/>
+              <w:top w:val="single" w:sz="6" w:space="0" w:color="auto"/>
+              <w:left w:val="single" w:sz="6" w:space="0" w:color="auto"/>
+              <w:bottom w:val="single" w:sz="6" w:space="0" w:color="auto"/>
+              <w:right w:val="single" w:sz="6" w:space="0" w:color="auto"/>
             </w:tcBorders>
             <w:tcMar>
               <w:top w:w="240" w:type="dxa"/>
@@ -1650,17 +1220,13 @@
           </w:tcPr>
           <w:p>
             <w:pPr>
-              <w:spacing w:before="0" w:beforeAutospacing="off" w:after="0" w:afterAutospacing="off"/>
-              <w:rPr>
-                <w:b w:val="0"/>
-                <w:bCs w:val="0"/>
+              <w:spacing w:before="0"/>
+              <w:rPr>
                 <w:color w:val="1F1F1F"/>
               </w:rPr>
             </w:pPr>
             <w:r>
               <w:rPr>
-                <w:b w:val="0"/>
-                <w:bCs w:val="0"/>
                 <w:color w:val="1F1F1F"/>
               </w:rPr>
               <w:t>787</w:t>
@@ -1676,10 +1242,10 @@
           <w:tcPr>
             <w:tcW w:w="5074" w:type="dxa"/>
             <w:tcBorders>
-              <w:top w:val="single" w:sz="6"/>
-              <w:left w:val="single" w:sz="6"/>
-              <w:bottom w:val="single" w:sz="6"/>
-              <w:right w:val="single" w:sz="6"/>
+              <w:top w:val="single" w:sz="6" w:space="0" w:color="auto"/>
+              <w:left w:val="single" w:sz="6" w:space="0" w:color="auto"/>
+              <w:bottom w:val="single" w:sz="6" w:space="0" w:color="auto"/>
+              <w:right w:val="single" w:sz="6" w:space="0" w:color="auto"/>
             </w:tcBorders>
             <w:shd w:val="clear" w:color="auto" w:fill="EFEFEF"/>
             <w:tcMar>
@@ -1691,12 +1257,12 @@
           </w:tcPr>
           <w:p>
             <w:pPr>
-              <w:spacing w:before="0" w:beforeAutospacing="off" w:after="0" w:afterAutospacing="off"/>
+              <w:spacing w:before="0"/>
             </w:pPr>
             <w:r>
               <w:rPr>
-                <w:b w:val="1"/>
-                <w:bCs w:val="1"/>
+                <w:b/>
+                <w:bCs/>
                 <w:color w:val="1F1F1F"/>
               </w:rPr>
               <w:t>Pohlavie</w:t>
@@ -1707,10 +1273,10 @@
           <w:tcPr>
             <w:tcW w:w="3360" w:type="dxa"/>
             <w:tcBorders>
-              <w:top w:val="single" w:sz="6"/>
-              <w:left w:val="single" w:sz="6"/>
-              <w:bottom w:val="single" w:sz="6"/>
-              <w:right w:val="single" w:sz="6"/>
+              <w:top w:val="single" w:sz="6" w:space="0" w:color="auto"/>
+              <w:left w:val="single" w:sz="6" w:space="0" w:color="auto"/>
+              <w:bottom w:val="single" w:sz="6" w:space="0" w:color="auto"/>
+              <w:right w:val="single" w:sz="6" w:space="0" w:color="auto"/>
             </w:tcBorders>
             <w:shd w:val="clear" w:color="auto" w:fill="EFEFEF"/>
             <w:tcMar>
@@ -1721,12 +1287,12 @@
           </w:tcPr>
           <w:p>
             <w:pPr>
-              <w:spacing w:before="0" w:beforeAutospacing="off" w:after="0" w:afterAutospacing="off"/>
+              <w:spacing w:before="0"/>
             </w:pPr>
             <w:r>
               <w:rPr>
-                <w:b w:val="1"/>
-                <w:bCs w:val="1"/>
+                <w:b/>
+                <w:bCs/>
                 <w:color w:val="1F1F1F"/>
               </w:rPr>
               <w:t>Počet riadkov</w:t>
@@ -1742,10 +1308,10 @@
           <w:tcPr>
             <w:tcW w:w="5074" w:type="dxa"/>
             <w:tcBorders>
-              <w:top w:val="single" w:sz="6"/>
-              <w:left w:val="single" w:sz="6"/>
-              <w:bottom w:val="single" w:sz="6"/>
-              <w:right w:val="single" w:sz="6"/>
+              <w:top w:val="single" w:sz="6" w:space="0" w:color="auto"/>
+              <w:left w:val="single" w:sz="6" w:space="0" w:color="auto"/>
+              <w:bottom w:val="single" w:sz="6" w:space="0" w:color="auto"/>
+              <w:right w:val="single" w:sz="6" w:space="0" w:color="auto"/>
             </w:tcBorders>
             <w:tcMar>
               <w:top w:w="240" w:type="dxa"/>
@@ -1756,12 +1322,12 @@
           </w:tcPr>
           <w:p>
             <w:pPr>
-              <w:spacing w:before="0" w:beforeAutospacing="off" w:after="0" w:afterAutospacing="off"/>
+              <w:spacing w:before="0"/>
             </w:pPr>
             <w:r>
               <w:rPr>
-                <w:b w:val="1"/>
-                <w:bCs w:val="1"/>
+                <w:b/>
+                <w:bCs/>
                 <w:color w:val="1F1F1F"/>
               </w:rPr>
               <w:t>M</w:t>
@@ -1772,10 +1338,10 @@
           <w:tcPr>
             <w:tcW w:w="3360" w:type="dxa"/>
             <w:tcBorders>
-              <w:top w:val="single" w:sz="6"/>
-              <w:left w:val="single" w:sz="6"/>
-              <w:bottom w:val="single" w:sz="6"/>
-              <w:right w:val="single" w:sz="6"/>
+              <w:top w:val="single" w:sz="6" w:space="0" w:color="auto"/>
+              <w:left w:val="single" w:sz="6" w:space="0" w:color="auto"/>
+              <w:bottom w:val="single" w:sz="6" w:space="0" w:color="auto"/>
+              <w:right w:val="single" w:sz="6" w:space="0" w:color="auto"/>
             </w:tcBorders>
             <w:tcMar>
               <w:top w:w="240" w:type="dxa"/>
@@ -1785,7 +1351,7 @@
           </w:tcPr>
           <w:p>
             <w:pPr>
-              <w:spacing w:before="0" w:beforeAutospacing="off" w:after="0" w:afterAutospacing="off"/>
+              <w:spacing w:before="0"/>
             </w:pPr>
             <w:r>
               <w:rPr>
@@ -1804,10 +1370,10 @@
           <w:tcPr>
             <w:tcW w:w="5074" w:type="dxa"/>
             <w:tcBorders>
-              <w:top w:val="single" w:sz="6"/>
-              <w:left w:val="single" w:sz="6"/>
-              <w:bottom w:val="single" w:sz="6"/>
-              <w:right w:val="single" w:sz="6"/>
+              <w:top w:val="single" w:sz="6" w:space="0" w:color="auto"/>
+              <w:left w:val="single" w:sz="6" w:space="0" w:color="auto"/>
+              <w:bottom w:val="single" w:sz="6" w:space="0" w:color="auto"/>
+              <w:right w:val="single" w:sz="6" w:space="0" w:color="auto"/>
             </w:tcBorders>
             <w:tcMar>
               <w:top w:w="240" w:type="dxa"/>
@@ -1818,12 +1384,12 @@
           </w:tcPr>
           <w:p>
             <w:pPr>
-              <w:spacing w:before="0" w:beforeAutospacing="off" w:after="0" w:afterAutospacing="off"/>
+              <w:spacing w:before="0"/>
             </w:pPr>
             <w:r>
               <w:rPr>
-                <w:b w:val="1"/>
-                <w:bCs w:val="1"/>
+                <w:b/>
+                <w:bCs/>
                 <w:color w:val="1F1F1F"/>
               </w:rPr>
               <w:t>F</w:t>
@@ -1834,10 +1400,10 @@
           <w:tcPr>
             <w:tcW w:w="3360" w:type="dxa"/>
             <w:tcBorders>
-              <w:top w:val="single" w:sz="6"/>
-              <w:left w:val="single" w:sz="6"/>
-              <w:bottom w:val="single" w:sz="6"/>
-              <w:right w:val="single" w:sz="6"/>
+              <w:top w:val="single" w:sz="6" w:space="0" w:color="auto"/>
+              <w:left w:val="single" w:sz="6" w:space="0" w:color="auto"/>
+              <w:bottom w:val="single" w:sz="6" w:space="0" w:color="auto"/>
+              <w:right w:val="single" w:sz="6" w:space="0" w:color="auto"/>
             </w:tcBorders>
             <w:tcMar>
               <w:top w:w="240" w:type="dxa"/>
@@ -1847,7 +1413,7 @@
           </w:tcPr>
           <w:p>
             <w:pPr>
-              <w:spacing w:before="0" w:beforeAutospacing="off" w:after="0" w:afterAutospacing="off"/>
+              <w:spacing w:before="0"/>
             </w:pPr>
             <w:r>
               <w:rPr>
@@ -1859,16 +1425,8 @@
         </w:tc>
       </w:tr>
     </w:tbl>
-    <w:p>
-      <w:pPr>
-        <w:pStyle w:val="Normlny"/>
-      </w:pPr>
-    </w:p>
-    <w:p>
-      <w:pPr>
-        <w:pStyle w:val="Normlny"/>
-      </w:pPr>
-    </w:p>
+    <w:p/>
+    <w:p/>
     <w:p>
       <w:pPr>
         <w:pStyle w:val="Nadpis1"/>
@@ -1886,12 +1444,12 @@
         <w:spacing w:after="20"/>
         <w:ind w:left="360" w:hanging="360"/>
         <w:rPr>
-          <w:lang w:val="sk-SK"/>
-        </w:rPr>
-      </w:pPr>
-      <w:r>
-        <w:rPr>
-          <w:lang w:val="sk-SK"/>
+          <w:lang w:val="en-GB"/>
+        </w:rPr>
+      </w:pPr>
+      <w:r>
+        <w:rPr>
+          <w:lang w:val="en-GB"/>
         </w:rPr>
         <w:t>dátumy neboli jednotné a museli sa previesť na jeden formát</w:t>
       </w:r>
@@ -1905,12 +1463,12 @@
         <w:spacing w:after="20"/>
         <w:ind w:left="360" w:hanging="360"/>
         <w:rPr>
-          <w:lang w:val="sk-SK"/>
-        </w:rPr>
-      </w:pPr>
-      <w:r>
-        <w:rPr>
-          <w:lang w:val="sk-SK"/>
+          <w:lang w:val="en-GB"/>
+        </w:rPr>
+      </w:pPr>
+      <w:r>
+        <w:rPr>
+          <w:lang w:val="en-GB"/>
         </w:rPr>
         <w:t>výsledky neboli len čísla, boli tam aj texty ako hemolýza, nepočítané alebo negatívny nález</w:t>
       </w:r>
@@ -1924,29 +1482,21 @@
         <w:spacing w:after="20"/>
         <w:ind w:left="360" w:hanging="360"/>
         <w:rPr>
-          <w:lang w:val="sk-SK"/>
-        </w:rPr>
-      </w:pPr>
-      <w:r>
-        <w:rPr>
-          <w:lang w:val="sk-SK"/>
+          <w:lang w:val="en-GB"/>
+        </w:rPr>
+      </w:pPr>
+      <w:r>
+        <w:rPr>
+          <w:lang w:val="en-GB"/>
         </w:rPr>
         <w:t>desatinné čísla boli často s čiarkou, čo bolo treba upraviť</w:t>
       </w:r>
       <w:r>
         <w:rPr>
-          <w:lang w:val="sk-SK"/>
-        </w:rPr>
-        <w:t xml:space="preserve"> a </w:t>
-      </w:r>
-      <w:proofErr w:type="spellStart"/>
-      <w:r>
-        <w:rPr>
-          <w:lang w:val="sk-SK"/>
-        </w:rPr>
-        <w:t>zjednodiť</w:t>
-      </w:r>
-      <w:proofErr w:type="spellEnd"/>
+          <w:lang w:val="en-GB"/>
+        </w:rPr>
+        <w:t xml:space="preserve"> a zjednodiť</w:t>
+      </w:r>
     </w:p>
     <w:p>
       <w:pPr>
@@ -1957,12 +1507,12 @@
         <w:spacing w:after="20"/>
         <w:ind w:left="360" w:hanging="360"/>
         <w:rPr>
-          <w:lang w:val="sk-SK"/>
-        </w:rPr>
-      </w:pPr>
-      <w:r>
-        <w:rPr>
-          <w:lang w:val="sk-SK"/>
+          <w:lang w:val="en-GB"/>
+        </w:rPr>
+      </w:pPr>
+      <w:r>
+        <w:rPr>
+          <w:lang w:val="en-GB"/>
         </w:rPr>
         <w:t>hodnoty typu &lt; 2,90 alebo &gt; 100 bolo treba zachovať aj s príznakom</w:t>
       </w:r>
@@ -1976,40 +1526,40 @@
         <w:spacing w:after="20"/>
         <w:ind w:left="360" w:hanging="360"/>
         <w:rPr>
-          <w:b w:val="1"/>
-          <w:bCs w:val="1"/>
-          <w:lang w:val="sk-SK"/>
-        </w:rPr>
-      </w:pPr>
-      <w:r>
-        <w:rPr>
-          <w:b w:val="1"/>
-          <w:bCs w:val="1"/>
-          <w:lang w:val="sk-SK"/>
+          <w:b/>
+          <w:bCs/>
+          <w:lang w:val="en-GB"/>
+        </w:rPr>
+      </w:pPr>
+      <w:r>
+        <w:rPr>
+          <w:b/>
+          <w:bCs/>
+          <w:lang w:val="en-GB"/>
         </w:rPr>
         <w:t xml:space="preserve">a hlavne </w:t>
       </w:r>
       <w:r>
         <w:rPr>
-          <w:b w:val="1"/>
-          <w:bCs w:val="1"/>
-          <w:lang w:val="sk-SK"/>
+          <w:b/>
+          <w:bCs/>
+          <w:lang w:val="en-GB"/>
         </w:rPr>
         <w:t xml:space="preserve">pacient nemal hotové ID, preto sme ho vytvorili z </w:t>
       </w:r>
       <w:r>
         <w:rPr>
-          <w:b w:val="1"/>
-          <w:bCs w:val="1"/>
-          <w:lang w:val="sk-SK"/>
+          <w:b/>
+          <w:bCs/>
+          <w:lang w:val="en-GB"/>
         </w:rPr>
         <w:t xml:space="preserve">fiktívneho </w:t>
       </w:r>
       <w:r>
         <w:rPr>
-          <w:b w:val="1"/>
-          <w:bCs w:val="1"/>
-          <w:lang w:val="sk-SK"/>
+          <w:b/>
+          <w:bCs/>
+          <w:lang w:val="en-GB"/>
         </w:rPr>
         <w:t>dátumu narodenia</w:t>
       </w:r>
@@ -2036,16 +1586,10 @@
             <w:vAlign w:val="center"/>
           </w:tcPr>
           <w:p>
-            <w:pPr>
-              <w:rPr>
-                <w:lang w:val="sk-SK"/>
-              </w:rPr>
-            </w:pPr>
             <w:r>
               <w:rPr>
                 <w:color w:val="FFFFFF"/>
                 <w:sz w:val="17"/>
-                <w:lang w:val="sk-SK"/>
               </w:rPr>
               <w:t>Pôvodná hodnota</w:t>
             </w:r>
@@ -2058,16 +1602,10 @@
             <w:vAlign w:val="center"/>
           </w:tcPr>
           <w:p>
-            <w:pPr>
-              <w:rPr>
-                <w:lang w:val="sk-SK"/>
-              </w:rPr>
-            </w:pPr>
             <w:r>
               <w:rPr>
                 <w:color w:val="FFFFFF"/>
                 <w:sz w:val="17"/>
-                <w:lang w:val="sk-SK"/>
               </w:rPr>
               <w:t xml:space="preserve">Ako sme ju po úprave </w:t>
             </w:r>
@@ -2075,7 +1613,6 @@
               <w:rPr>
                 <w:color w:val="FFFFFF"/>
                 <w:sz w:val="17"/>
-                <w:lang w:val="sk-SK"/>
               </w:rPr>
               <w:t>zjednotili</w:t>
             </w:r>
@@ -2092,15 +1629,9 @@
             <w:vAlign w:val="center"/>
           </w:tcPr>
           <w:p>
-            <w:pPr>
-              <w:rPr>
-                <w:lang w:val="sk-SK"/>
-              </w:rPr>
-            </w:pPr>
-            <w:r>
-              <w:rPr>
-                <w:sz w:val="17"/>
-                <w:lang w:val="sk-SK"/>
+            <w:r>
+              <w:rPr>
+                <w:sz w:val="17"/>
               </w:rPr>
               <w:t>5,4</w:t>
             </w:r>
@@ -2112,15 +1643,9 @@
             <w:vAlign w:val="center"/>
           </w:tcPr>
           <w:p>
-            <w:pPr>
-              <w:rPr>
-                <w:lang w:val="sk-SK"/>
-              </w:rPr>
-            </w:pPr>
-            <w:r>
-              <w:rPr>
-                <w:sz w:val="17"/>
-                <w:lang w:val="sk-SK"/>
+            <w:r>
+              <w:rPr>
+                <w:sz w:val="17"/>
               </w:rPr>
               <w:t>číselná hodnota 5.4</w:t>
             </w:r>
@@ -2137,15 +1662,9 @@
             <w:vAlign w:val="center"/>
           </w:tcPr>
           <w:p>
-            <w:pPr>
-              <w:rPr>
-                <w:lang w:val="sk-SK"/>
-              </w:rPr>
-            </w:pPr>
-            <w:r>
-              <w:rPr>
-                <w:sz w:val="17"/>
-                <w:lang w:val="sk-SK"/>
+            <w:r>
+              <w:rPr>
+                <w:sz w:val="17"/>
               </w:rPr>
               <w:t>&lt; 2,90</w:t>
             </w:r>
@@ -2157,15 +1676,9 @@
             <w:vAlign w:val="center"/>
           </w:tcPr>
           <w:p>
-            <w:pPr>
-              <w:rPr>
-                <w:lang w:val="sk-SK"/>
-              </w:rPr>
-            </w:pPr>
-            <w:r>
-              <w:rPr>
-                <w:sz w:val="17"/>
-                <w:lang w:val="sk-SK"/>
+            <w:r>
+              <w:rPr>
+                <w:sz w:val="17"/>
               </w:rPr>
               <w:t>hodnota 2.90 a príznak &lt;</w:t>
             </w:r>
@@ -2182,17 +1695,10 @@
             <w:vAlign w:val="center"/>
           </w:tcPr>
           <w:p>
-            <w:pPr>
-              <w:rPr>
-                <w:lang w:val="sk-SK"/>
-              </w:rPr>
-            </w:pPr>
-            <w:r>
-              <w:rPr>
-                <w:sz w:val="17"/>
-                <w:lang w:val="sk-SK"/>
-              </w:rPr>
-              <w:lastRenderedPageBreak/>
+            <w:r>
+              <w:rPr>
+                <w:sz w:val="17"/>
+              </w:rPr>
               <w:t>hemolýza</w:t>
             </w:r>
           </w:p>
@@ -2203,15 +1709,9 @@
             <w:vAlign w:val="center"/>
           </w:tcPr>
           <w:p>
-            <w:pPr>
-              <w:rPr>
-                <w:lang w:val="sk-SK"/>
-              </w:rPr>
-            </w:pPr>
-            <w:r>
-              <w:rPr>
-                <w:sz w:val="17"/>
-                <w:lang w:val="sk-SK"/>
+            <w:r>
+              <w:rPr>
+                <w:sz w:val="17"/>
               </w:rPr>
               <w:t>nepoužiteľné pre výpočet</w:t>
             </w:r>
@@ -2228,15 +1728,9 @@
             <w:vAlign w:val="center"/>
           </w:tcPr>
           <w:p>
-            <w:pPr>
-              <w:rPr>
-                <w:lang w:val="sk-SK"/>
-              </w:rPr>
-            </w:pPr>
-            <w:r>
-              <w:rPr>
-                <w:sz w:val="17"/>
-                <w:lang w:val="sk-SK"/>
+            <w:r>
+              <w:rPr>
+                <w:sz w:val="17"/>
               </w:rPr>
               <w:t>Negatívny nález</w:t>
             </w:r>
@@ -2248,15 +1742,9 @@
             <w:vAlign w:val="center"/>
           </w:tcPr>
           <w:p>
-            <w:pPr>
-              <w:rPr>
-                <w:lang w:val="sk-SK"/>
-              </w:rPr>
-            </w:pPr>
-            <w:r>
-              <w:rPr>
-                <w:sz w:val="17"/>
-                <w:lang w:val="sk-SK"/>
+            <w:r>
+              <w:rPr>
+                <w:sz w:val="17"/>
               </w:rPr>
               <w:t>genetický výsledok</w:t>
             </w:r>
@@ -2273,15 +1761,9 @@
             <w:vAlign w:val="center"/>
           </w:tcPr>
           <w:p>
-            <w:pPr>
-              <w:rPr>
-                <w:lang w:val="sk-SK"/>
-              </w:rPr>
-            </w:pPr>
-            <w:r>
-              <w:rPr>
-                <w:sz w:val="17"/>
-                <w:lang w:val="sk-SK"/>
+            <w:r>
+              <w:rPr>
+                <w:sz w:val="17"/>
               </w:rPr>
               <w:t>Pozitívny nález</w:t>
             </w:r>
@@ -2293,15 +1775,9 @@
             <w:vAlign w:val="center"/>
           </w:tcPr>
           <w:p>
-            <w:pPr>
-              <w:rPr>
-                <w:lang w:val="sk-SK"/>
-              </w:rPr>
-            </w:pPr>
-            <w:r>
-              <w:rPr>
-                <w:sz w:val="17"/>
-                <w:lang w:val="sk-SK"/>
+            <w:r>
+              <w:rPr>
+                <w:sz w:val="17"/>
               </w:rPr>
               <w:t>genetický výsledok pre HFE status</w:t>
             </w:r>
@@ -2311,7 +1787,7 @@
     </w:tbl>
     <w:p>
       <w:pPr>
-        <w:pStyle w:val="Nadpis1"/>
+        <w:pStyle w:val="Titlistudaje"/>
       </w:pPr>
       <w:r>
         <w:t>Čo sme do dát doplnili</w:t>
@@ -2319,6 +1795,7 @@
     </w:p>
     <w:p>
       <w:r>
+        <w:lastRenderedPageBreak/>
         <w:t>Nepridávali sme žiadne vymyslené výsledky. Pridali sme len pomocné stĺpce, aby sa s dátami lepšie pracovalo v programe.</w:t>
       </w:r>
     </w:p>
@@ -2344,16 +1821,10 @@
             <w:vAlign w:val="center"/>
           </w:tcPr>
           <w:p>
-            <w:pPr>
-              <w:rPr>
-                <w:lang w:val="sk-SK"/>
-              </w:rPr>
-            </w:pPr>
             <w:r>
               <w:rPr>
                 <w:color w:val="FFFFFF"/>
                 <w:sz w:val="17"/>
-                <w:lang w:val="sk-SK"/>
               </w:rPr>
               <w:t>Nový stĺpec</w:t>
             </w:r>
@@ -2366,16 +1837,10 @@
             <w:vAlign w:val="center"/>
           </w:tcPr>
           <w:p>
-            <w:pPr>
-              <w:rPr>
-                <w:lang w:val="sk-SK"/>
-              </w:rPr>
-            </w:pPr>
             <w:r>
               <w:rPr>
                 <w:color w:val="FFFFFF"/>
                 <w:sz w:val="17"/>
-                <w:lang w:val="sk-SK"/>
               </w:rPr>
               <w:t>Význam</w:t>
             </w:r>
@@ -2392,37 +1857,23 @@
             <w:vAlign w:val="center"/>
           </w:tcPr>
           <w:p>
-            <w:pPr>
-              <w:rPr>
-                <w:lang w:val="sk-SK"/>
-              </w:rPr>
-            </w:pPr>
-            <w:proofErr w:type="spellStart"/>
-            <w:r>
-              <w:rPr>
-                <w:sz w:val="17"/>
-                <w:lang w:val="sk-SK"/>
+            <w:r>
+              <w:rPr>
+                <w:sz w:val="17"/>
               </w:rPr>
               <w:t>Datum_O_clean</w:t>
             </w:r>
-            <w:proofErr w:type="spellEnd"/>
-          </w:p>
-        </w:tc>
-        <w:tc>
-          <w:tcPr>
-            <w:tcW w:w="5156" w:type="dxa"/>
-            <w:vAlign w:val="center"/>
-          </w:tcPr>
-          <w:p>
-            <w:pPr>
-              <w:rPr>
-                <w:lang w:val="sk-SK"/>
-              </w:rPr>
-            </w:pPr>
-            <w:r>
-              <w:rPr>
-                <w:sz w:val="17"/>
-                <w:lang w:val="sk-SK"/>
+          </w:p>
+        </w:tc>
+        <w:tc>
+          <w:tcPr>
+            <w:tcW w:w="5156" w:type="dxa"/>
+            <w:vAlign w:val="center"/>
+          </w:tcPr>
+          <w:p>
+            <w:r>
+              <w:rPr>
+                <w:sz w:val="17"/>
               </w:rPr>
               <w:t>upravený dátum odberu</w:t>
             </w:r>
@@ -2439,37 +1890,23 @@
             <w:vAlign w:val="center"/>
           </w:tcPr>
           <w:p>
-            <w:pPr>
-              <w:rPr>
-                <w:lang w:val="sk-SK"/>
-              </w:rPr>
-            </w:pPr>
-            <w:proofErr w:type="spellStart"/>
-            <w:r>
-              <w:rPr>
-                <w:sz w:val="17"/>
-                <w:lang w:val="sk-SK"/>
+            <w:r>
+              <w:rPr>
+                <w:sz w:val="17"/>
               </w:rPr>
               <w:t>Datum_Nar_clean</w:t>
             </w:r>
-            <w:proofErr w:type="spellEnd"/>
-          </w:p>
-        </w:tc>
-        <w:tc>
-          <w:tcPr>
-            <w:tcW w:w="5156" w:type="dxa"/>
-            <w:vAlign w:val="center"/>
-          </w:tcPr>
-          <w:p>
-            <w:pPr>
-              <w:rPr>
-                <w:lang w:val="sk-SK"/>
-              </w:rPr>
-            </w:pPr>
-            <w:r>
-              <w:rPr>
-                <w:sz w:val="17"/>
-                <w:lang w:val="sk-SK"/>
+          </w:p>
+        </w:tc>
+        <w:tc>
+          <w:tcPr>
+            <w:tcW w:w="5156" w:type="dxa"/>
+            <w:vAlign w:val="center"/>
+          </w:tcPr>
+          <w:p>
+            <w:r>
+              <w:rPr>
+                <w:sz w:val="17"/>
               </w:rPr>
               <w:t>upravený dátum narodenia</w:t>
             </w:r>
@@ -2486,37 +1923,23 @@
             <w:vAlign w:val="center"/>
           </w:tcPr>
           <w:p>
-            <w:pPr>
-              <w:rPr>
-                <w:lang w:val="sk-SK"/>
-              </w:rPr>
-            </w:pPr>
-            <w:proofErr w:type="spellStart"/>
-            <w:r>
-              <w:rPr>
-                <w:sz w:val="17"/>
-                <w:lang w:val="sk-SK"/>
+            <w:r>
+              <w:rPr>
+                <w:sz w:val="17"/>
               </w:rPr>
               <w:t>Patient_ID</w:t>
             </w:r>
-            <w:proofErr w:type="spellEnd"/>
-          </w:p>
-        </w:tc>
-        <w:tc>
-          <w:tcPr>
-            <w:tcW w:w="5156" w:type="dxa"/>
-            <w:vAlign w:val="center"/>
-          </w:tcPr>
-          <w:p>
-            <w:pPr>
-              <w:rPr>
-                <w:lang w:val="sk-SK"/>
-              </w:rPr>
-            </w:pPr>
-            <w:r>
-              <w:rPr>
-                <w:sz w:val="17"/>
-                <w:lang w:val="sk-SK"/>
+          </w:p>
+        </w:tc>
+        <w:tc>
+          <w:tcPr>
+            <w:tcW w:w="5156" w:type="dxa"/>
+            <w:vAlign w:val="center"/>
+          </w:tcPr>
+          <w:p>
+            <w:r>
+              <w:rPr>
+                <w:sz w:val="17"/>
               </w:rPr>
               <w:t>identifikátor pacienta vytvorený z dátumu narodenia</w:t>
             </w:r>
@@ -2533,37 +1956,23 @@
             <w:vAlign w:val="center"/>
           </w:tcPr>
           <w:p>
-            <w:pPr>
-              <w:rPr>
-                <w:lang w:val="sk-SK"/>
-              </w:rPr>
-            </w:pPr>
-            <w:proofErr w:type="spellStart"/>
-            <w:r>
-              <w:rPr>
-                <w:sz w:val="17"/>
-                <w:lang w:val="sk-SK"/>
+            <w:r>
+              <w:rPr>
+                <w:sz w:val="17"/>
               </w:rPr>
               <w:t>Vysl_text_clean</w:t>
             </w:r>
-            <w:proofErr w:type="spellEnd"/>
-          </w:p>
-        </w:tc>
-        <w:tc>
-          <w:tcPr>
-            <w:tcW w:w="5156" w:type="dxa"/>
-            <w:vAlign w:val="center"/>
-          </w:tcPr>
-          <w:p>
-            <w:pPr>
-              <w:rPr>
-                <w:lang w:val="sk-SK"/>
-              </w:rPr>
-            </w:pPr>
-            <w:r>
-              <w:rPr>
-                <w:sz w:val="17"/>
-                <w:lang w:val="sk-SK"/>
+          </w:p>
+        </w:tc>
+        <w:tc>
+          <w:tcPr>
+            <w:tcW w:w="5156" w:type="dxa"/>
+            <w:vAlign w:val="center"/>
+          </w:tcPr>
+          <w:p>
+            <w:r>
+              <w:rPr>
+                <w:sz w:val="17"/>
               </w:rPr>
               <w:t>očistený text výsledku</w:t>
             </w:r>
@@ -2580,37 +1989,23 @@
             <w:vAlign w:val="center"/>
           </w:tcPr>
           <w:p>
-            <w:pPr>
-              <w:rPr>
-                <w:lang w:val="sk-SK"/>
-              </w:rPr>
-            </w:pPr>
-            <w:proofErr w:type="spellStart"/>
-            <w:r>
-              <w:rPr>
-                <w:sz w:val="17"/>
-                <w:lang w:val="sk-SK"/>
+            <w:r>
+              <w:rPr>
+                <w:sz w:val="17"/>
               </w:rPr>
               <w:t>Vysl_numeric</w:t>
             </w:r>
-            <w:proofErr w:type="spellEnd"/>
-          </w:p>
-        </w:tc>
-        <w:tc>
-          <w:tcPr>
-            <w:tcW w:w="5156" w:type="dxa"/>
-            <w:vAlign w:val="center"/>
-          </w:tcPr>
-          <w:p>
-            <w:pPr>
-              <w:rPr>
-                <w:lang w:val="sk-SK"/>
-              </w:rPr>
-            </w:pPr>
-            <w:r>
-              <w:rPr>
-                <w:sz w:val="17"/>
-                <w:lang w:val="sk-SK"/>
+          </w:p>
+        </w:tc>
+        <w:tc>
+          <w:tcPr>
+            <w:tcW w:w="5156" w:type="dxa"/>
+            <w:vAlign w:val="center"/>
+          </w:tcPr>
+          <w:p>
+            <w:r>
+              <w:rPr>
+                <w:sz w:val="17"/>
               </w:rPr>
               <w:t>číselná hodnota, ak sa dala získať</w:t>
             </w:r>
@@ -2627,37 +2022,23 @@
             <w:vAlign w:val="center"/>
           </w:tcPr>
           <w:p>
-            <w:pPr>
-              <w:rPr>
-                <w:lang w:val="sk-SK"/>
-              </w:rPr>
-            </w:pPr>
-            <w:proofErr w:type="spellStart"/>
-            <w:r>
-              <w:rPr>
-                <w:sz w:val="17"/>
-                <w:lang w:val="sk-SK"/>
+            <w:r>
+              <w:rPr>
+                <w:sz w:val="17"/>
               </w:rPr>
               <w:t>Vysl_flag</w:t>
             </w:r>
-            <w:proofErr w:type="spellEnd"/>
-          </w:p>
-        </w:tc>
-        <w:tc>
-          <w:tcPr>
-            <w:tcW w:w="5156" w:type="dxa"/>
-            <w:vAlign w:val="center"/>
-          </w:tcPr>
-          <w:p>
-            <w:pPr>
-              <w:rPr>
-                <w:lang w:val="sk-SK"/>
-              </w:rPr>
-            </w:pPr>
-            <w:r>
-              <w:rPr>
-                <w:sz w:val="17"/>
-                <w:lang w:val="sk-SK"/>
+          </w:p>
+        </w:tc>
+        <w:tc>
+          <w:tcPr>
+            <w:tcW w:w="5156" w:type="dxa"/>
+            <w:vAlign w:val="center"/>
+          </w:tcPr>
+          <w:p>
+            <w:r>
+              <w:rPr>
+                <w:sz w:val="17"/>
               </w:rPr>
               <w:t>značka &lt; alebo &gt;</w:t>
             </w:r>
@@ -2674,37 +2055,23 @@
             <w:vAlign w:val="center"/>
           </w:tcPr>
           <w:p>
-            <w:pPr>
-              <w:rPr>
-                <w:lang w:val="sk-SK"/>
-              </w:rPr>
-            </w:pPr>
-            <w:proofErr w:type="spellStart"/>
-            <w:r>
-              <w:rPr>
-                <w:sz w:val="17"/>
-                <w:lang w:val="sk-SK"/>
+            <w:r>
+              <w:rPr>
+                <w:sz w:val="17"/>
               </w:rPr>
               <w:t>Is_HFE</w:t>
             </w:r>
-            <w:proofErr w:type="spellEnd"/>
-          </w:p>
-        </w:tc>
-        <w:tc>
-          <w:tcPr>
-            <w:tcW w:w="5156" w:type="dxa"/>
-            <w:vAlign w:val="center"/>
-          </w:tcPr>
-          <w:p>
-            <w:pPr>
-              <w:rPr>
-                <w:lang w:val="sk-SK"/>
-              </w:rPr>
-            </w:pPr>
-            <w:r>
-              <w:rPr>
-                <w:sz w:val="17"/>
-                <w:lang w:val="sk-SK"/>
+          </w:p>
+        </w:tc>
+        <w:tc>
+          <w:tcPr>
+            <w:tcW w:w="5156" w:type="dxa"/>
+            <w:vAlign w:val="center"/>
+          </w:tcPr>
+          <w:p>
+            <w:r>
+              <w:rPr>
+                <w:sz w:val="17"/>
               </w:rPr>
               <w:t>či ide o HFE genetické vyšetrenie</w:t>
             </w:r>
@@ -2721,37 +2088,23 @@
             <w:vAlign w:val="center"/>
           </w:tcPr>
           <w:p>
-            <w:pPr>
-              <w:rPr>
-                <w:lang w:val="sk-SK"/>
-              </w:rPr>
-            </w:pPr>
-            <w:proofErr w:type="spellStart"/>
-            <w:r>
-              <w:rPr>
-                <w:sz w:val="17"/>
-                <w:lang w:val="sk-SK"/>
+            <w:r>
+              <w:rPr>
+                <w:sz w:val="17"/>
               </w:rPr>
               <w:t>HFE_status</w:t>
             </w:r>
-            <w:proofErr w:type="spellEnd"/>
-          </w:p>
-        </w:tc>
-        <w:tc>
-          <w:tcPr>
-            <w:tcW w:w="5156" w:type="dxa"/>
-            <w:vAlign w:val="center"/>
-          </w:tcPr>
-          <w:p>
-            <w:pPr>
-              <w:rPr>
-                <w:lang w:val="sk-SK"/>
-              </w:rPr>
-            </w:pPr>
-            <w:r>
-              <w:rPr>
-                <w:sz w:val="17"/>
-                <w:lang w:val="sk-SK"/>
+          </w:p>
+        </w:tc>
+        <w:tc>
+          <w:tcPr>
+            <w:tcW w:w="5156" w:type="dxa"/>
+            <w:vAlign w:val="center"/>
+          </w:tcPr>
+          <w:p>
+            <w:r>
+              <w:rPr>
+                <w:sz w:val="17"/>
               </w:rPr>
               <w:t>zjednodušený genetický výsledok</w:t>
             </w:r>
@@ -2768,148 +2121,51 @@
             <w:vAlign w:val="center"/>
           </w:tcPr>
           <w:p>
-            <w:pPr>
-              <w:rPr>
-                <w:lang w:val="sk-SK"/>
-              </w:rPr>
-            </w:pPr>
-            <w:proofErr w:type="spellStart"/>
-            <w:r>
-              <w:rPr>
-                <w:sz w:val="17"/>
-                <w:lang w:val="sk-SK"/>
+            <w:r>
+              <w:rPr>
+                <w:sz w:val="17"/>
               </w:rPr>
               <w:t>Result_type</w:t>
             </w:r>
-            <w:proofErr w:type="spellEnd"/>
-          </w:p>
-        </w:tc>
-        <w:tc>
-          <w:tcPr>
-            <w:tcW w:w="5156" w:type="dxa"/>
-            <w:vAlign w:val="center"/>
-          </w:tcPr>
-          <w:p>
-            <w:pPr>
-              <w:rPr>
-                <w:lang w:val="sk-SK"/>
-              </w:rPr>
-            </w:pPr>
-            <w:proofErr w:type="spellStart"/>
-            <w:r>
-              <w:rPr>
-                <w:sz w:val="17"/>
-                <w:lang w:val="sk-SK"/>
-              </w:rPr>
-              <w:t>numeric</w:t>
-            </w:r>
-            <w:proofErr w:type="spellEnd"/>
-            <w:r>
-              <w:rPr>
-                <w:sz w:val="17"/>
-                <w:lang w:val="sk-SK"/>
-              </w:rPr>
-              <w:t xml:space="preserve">, text, </w:t>
-            </w:r>
-            <w:proofErr w:type="spellStart"/>
-            <w:r>
-              <w:rPr>
-                <w:sz w:val="17"/>
-                <w:lang w:val="sk-SK"/>
-              </w:rPr>
-              <w:t>genetic</w:t>
-            </w:r>
-            <w:proofErr w:type="spellEnd"/>
-            <w:r>
-              <w:rPr>
-                <w:sz w:val="17"/>
-                <w:lang w:val="sk-SK"/>
-              </w:rPr>
-              <w:t xml:space="preserve"> alebo </w:t>
-            </w:r>
-            <w:proofErr w:type="spellStart"/>
-            <w:r>
-              <w:rPr>
-                <w:sz w:val="17"/>
-                <w:lang w:val="sk-SK"/>
-              </w:rPr>
-              <w:t>missing</w:t>
-            </w:r>
-            <w:proofErr w:type="spellEnd"/>
+          </w:p>
+        </w:tc>
+        <w:tc>
+          <w:tcPr>
+            <w:tcW w:w="5156" w:type="dxa"/>
+            <w:vAlign w:val="center"/>
+          </w:tcPr>
+          <w:p>
+            <w:r>
+              <w:rPr>
+                <w:sz w:val="17"/>
+              </w:rPr>
+              <w:t>numeric, text, genetic alebo missing</w:t>
+            </w:r>
           </w:p>
         </w:tc>
       </w:tr>
     </w:tbl>
     <w:p/>
+    <w:p/>
+    <w:p/>
+    <w:p/>
     <w:p>
-      <w:pPr>
-        <w:pStyle w:val="Normlny"/>
-      </w:pPr>
-    </w:p>
-    <w:p>
-      <w:pPr>
-        <w:pStyle w:val="Normlny"/>
-      </w:pPr>
-    </w:p>
-    <w:p>
-      <w:pPr>
-        <w:pStyle w:val="Normlny"/>
-      </w:pPr>
-    </w:p>
-    <w:p>
-      <w:pPr>
-        <w:pStyle w:val="Normlny"/>
-      </w:pPr>
-      <w:r>
-        <w:rPr/>
-        <w:t xml:space="preserve">Najdôležitejšie bolo vytvoriť </w:t>
-      </w:r>
-      <w:r>
-        <w:rPr/>
-        <w:t>Patient_ID</w:t>
-      </w:r>
-      <w:r>
-        <w:rPr/>
-        <w:t>. Podľa zadania sme nepoužili iba rok narodenia, ale celý fiktívny dátum narodenia. Všetky riadky s rovnakým dátumom narodenia sme brali ako jedného pacienta.</w:t>
-      </w:r>
-      <w:r>
-        <w:rPr/>
-        <w:t xml:space="preserve"> Pri vytváraní profilu osoby sme použili fiktívny dátum narodenia pacienta, ktorý bol v </w:t>
-      </w:r>
-      <w:r>
-        <w:rPr/>
-        <w:t>datasete</w:t>
-      </w:r>
-      <w:r>
-        <w:rPr/>
-        <w:t xml:space="preserve"> určený na prepájanie záznamov. Zároveň sme zistili, že pri </w:t>
-      </w:r>
-      <w:r>
-        <w:rPr/>
+      <w:r>
+        <w:t>Najdôležitejšie bolo vytvoriť Patient_ID. Podľa zadania sme nepoužili iba rok narodenia, ale celý fiktívny dátum narodenia. Všetky riadky s rovnakým dátumom narodenia sme brali ako jedného pacienta.</w:t>
+      </w:r>
+      <w:r>
+        <w:t xml:space="preserve"> Pri vytváraní profilu osoby sme použili fiktívny dátum narodenia pacienta, ktorý bol v datasete určený na prepájanie záznamov. Zároveň sme zistili, že pri </w:t>
+      </w:r>
+      <w:r>
         <w:t>88</w:t>
       </w:r>
       <w:r>
-        <w:rPr/>
-        <w:t xml:space="preserve"> dátumoch narodenia sa nachádzali rozdielne hodnoty pohlavia. </w:t>
-      </w:r>
-      <w:r>
-        <w:rPr/>
-        <w:t xml:space="preserve">Takéto prípady sme označili ako </w:t>
-      </w:r>
-      <w:r>
-        <w:rPr/>
-        <w:t>mixed</w:t>
-      </w:r>
-      <w:r>
-        <w:rPr/>
-        <w:t xml:space="preserve"> </w:t>
-      </w:r>
-      <w:r>
-        <w:rPr/>
+        <w:t xml:space="preserve"> dátumoch narodenia sa nachádzali rozdielne hodnoty pohlavia. Takéto prípady sme označili ako mixed </w:t>
+      </w:r>
+      <w:r>
         <w:t xml:space="preserve">v stlĺpci pohlavie </w:t>
       </w:r>
       <w:r>
-        <w:rPr/>
         <w:t>a brali sme ich ako potenciálne nekonzistentné záznamy.</w:t>
       </w:r>
     </w:p>
@@ -2935,16 +2191,10 @@
             <w:vAlign w:val="center"/>
           </w:tcPr>
           <w:p>
-            <w:pPr>
-              <w:rPr>
-                <w:lang w:val="sk-SK"/>
-              </w:rPr>
-            </w:pPr>
             <w:r>
               <w:rPr>
                 <w:color w:val="FFFFFF"/>
                 <w:sz w:val="17"/>
-                <w:lang w:val="sk-SK"/>
               </w:rPr>
               <w:t>V profile je</w:t>
             </w:r>
@@ -2957,16 +2207,10 @@
             <w:vAlign w:val="center"/>
           </w:tcPr>
           <w:p>
-            <w:pPr>
-              <w:rPr>
-                <w:lang w:val="sk-SK"/>
-              </w:rPr>
-            </w:pPr>
             <w:r>
               <w:rPr>
                 <w:color w:val="FFFFFF"/>
                 <w:sz w:val="17"/>
-                <w:lang w:val="sk-SK"/>
               </w:rPr>
               <w:t>Prečo sa to hodí</w:t>
             </w:r>
@@ -2983,37 +2227,23 @@
             <w:vAlign w:val="center"/>
           </w:tcPr>
           <w:p>
-            <w:pPr>
-              <w:rPr>
-                <w:lang w:val="sk-SK"/>
-              </w:rPr>
-            </w:pPr>
-            <w:proofErr w:type="spellStart"/>
-            <w:r>
-              <w:rPr>
-                <w:sz w:val="17"/>
-                <w:lang w:val="sk-SK"/>
+            <w:r>
+              <w:rPr>
+                <w:sz w:val="17"/>
               </w:rPr>
               <w:t>Patient_ID</w:t>
             </w:r>
-            <w:proofErr w:type="spellEnd"/>
-          </w:p>
-        </w:tc>
-        <w:tc>
-          <w:tcPr>
-            <w:tcW w:w="5156" w:type="dxa"/>
-            <w:vAlign w:val="center"/>
-          </w:tcPr>
-          <w:p>
-            <w:pPr>
-              <w:rPr>
-                <w:lang w:val="sk-SK"/>
-              </w:rPr>
-            </w:pPr>
-            <w:r>
-              <w:rPr>
-                <w:sz w:val="17"/>
-                <w:lang w:val="sk-SK"/>
+          </w:p>
+        </w:tc>
+        <w:tc>
+          <w:tcPr>
+            <w:tcW w:w="5156" w:type="dxa"/>
+            <w:vAlign w:val="center"/>
+          </w:tcPr>
+          <w:p>
+            <w:r>
+              <w:rPr>
+                <w:sz w:val="17"/>
               </w:rPr>
               <w:t>výber konkrétneho pacienta</w:t>
             </w:r>
@@ -3030,15 +2260,9 @@
             <w:vAlign w:val="center"/>
           </w:tcPr>
           <w:p>
-            <w:pPr>
-              <w:rPr>
-                <w:lang w:val="sk-SK"/>
-              </w:rPr>
-            </w:pPr>
-            <w:r>
-              <w:rPr>
-                <w:sz w:val="17"/>
-                <w:lang w:val="sk-SK"/>
+            <w:r>
+              <w:rPr>
+                <w:sz w:val="17"/>
               </w:rPr>
               <w:t>Pohlavie a rok narodenia</w:t>
             </w:r>
@@ -3050,15 +2274,9 @@
             <w:vAlign w:val="center"/>
           </w:tcPr>
           <w:p>
-            <w:pPr>
-              <w:rPr>
-                <w:lang w:val="sk-SK"/>
-              </w:rPr>
-            </w:pPr>
-            <w:r>
-              <w:rPr>
-                <w:sz w:val="17"/>
-                <w:lang w:val="sk-SK"/>
+            <w:r>
+              <w:rPr>
+                <w:sz w:val="17"/>
               </w:rPr>
               <w:t>základné údaje</w:t>
             </w:r>
@@ -3075,15 +2293,9 @@
             <w:vAlign w:val="center"/>
           </w:tcPr>
           <w:p>
-            <w:pPr>
-              <w:rPr>
-                <w:lang w:val="sk-SK"/>
-              </w:rPr>
-            </w:pPr>
-            <w:r>
-              <w:rPr>
-                <w:sz w:val="17"/>
-                <w:lang w:val="sk-SK"/>
+            <w:r>
+              <w:rPr>
+                <w:sz w:val="17"/>
               </w:rPr>
               <w:t>Počet riadkov a vyšetrení</w:t>
             </w:r>
@@ -3095,15 +2307,9 @@
             <w:vAlign w:val="center"/>
           </w:tcPr>
           <w:p>
-            <w:pPr>
-              <w:rPr>
-                <w:lang w:val="sk-SK"/>
-              </w:rPr>
-            </w:pPr>
-            <w:r>
-              <w:rPr>
-                <w:sz w:val="17"/>
-                <w:lang w:val="sk-SK"/>
+            <w:r>
+              <w:rPr>
+                <w:sz w:val="17"/>
               </w:rPr>
               <w:t>prehľad, koľko dát má pacient</w:t>
             </w:r>
@@ -3120,15 +2326,9 @@
             <w:vAlign w:val="center"/>
           </w:tcPr>
           <w:p>
-            <w:pPr>
-              <w:rPr>
-                <w:lang w:val="sk-SK"/>
-              </w:rPr>
-            </w:pPr>
-            <w:r>
-              <w:rPr>
-                <w:sz w:val="17"/>
-                <w:lang w:val="sk-SK"/>
+            <w:r>
+              <w:rPr>
+                <w:sz w:val="17"/>
               </w:rPr>
               <w:t>Počet parametrov</w:t>
             </w:r>
@@ -3140,15 +2340,9 @@
             <w:vAlign w:val="center"/>
           </w:tcPr>
           <w:p>
-            <w:pPr>
-              <w:rPr>
-                <w:lang w:val="sk-SK"/>
-              </w:rPr>
-            </w:pPr>
-            <w:r>
-              <w:rPr>
-                <w:sz w:val="17"/>
-                <w:lang w:val="sk-SK"/>
+            <w:r>
+              <w:rPr>
+                <w:sz w:val="17"/>
               </w:rPr>
               <w:t>koľko rôznych výsledkov sa u neho nachádza</w:t>
             </w:r>
@@ -3165,37 +2359,23 @@
             <w:vAlign w:val="center"/>
           </w:tcPr>
           <w:p>
-            <w:pPr>
-              <w:rPr>
-                <w:lang w:val="sk-SK"/>
-              </w:rPr>
-            </w:pPr>
-            <w:proofErr w:type="spellStart"/>
-            <w:r>
-              <w:rPr>
-                <w:sz w:val="17"/>
-                <w:lang w:val="sk-SK"/>
+            <w:r>
+              <w:rPr>
+                <w:sz w:val="17"/>
               </w:rPr>
               <w:t>HFE_status</w:t>
             </w:r>
-            <w:proofErr w:type="spellEnd"/>
-          </w:p>
-        </w:tc>
-        <w:tc>
-          <w:tcPr>
-            <w:tcW w:w="5156" w:type="dxa"/>
-            <w:vAlign w:val="center"/>
-          </w:tcPr>
-          <w:p>
-            <w:pPr>
-              <w:rPr>
-                <w:lang w:val="sk-SK"/>
-              </w:rPr>
-            </w:pPr>
-            <w:r>
-              <w:rPr>
-                <w:sz w:val="17"/>
-                <w:lang w:val="sk-SK"/>
+          </w:p>
+        </w:tc>
+        <w:tc>
+          <w:tcPr>
+            <w:tcW w:w="5156" w:type="dxa"/>
+            <w:vAlign w:val="center"/>
+          </w:tcPr>
+          <w:p>
+            <w:r>
+              <w:rPr>
+                <w:sz w:val="17"/>
               </w:rPr>
               <w:t>neskôr na filtrovanie v aplikácii</w:t>
             </w:r>
@@ -3220,30 +2400,652 @@
     <w:p/>
     <w:p>
       <w:pPr>
+        <w:pStyle w:val="Nadpis1"/>
+      </w:pPr>
+      <w:r>
+        <w:lastRenderedPageBreak/>
+        <w:t>Popis aplikácie</w:t>
+      </w:r>
+    </w:p>
+    <w:p>
+      <w:pPr>
+        <w:rPr>
+          <w:lang w:val="en-US"/>
+        </w:rPr>
+      </w:pPr>
+      <w:r>
+        <w:rPr>
+          <w:lang w:val="en-US"/>
+        </w:rPr>
+        <w:t>Pre účely vizualizácie a interpretácie biomedicínskych dát bol navrhnutý a implementovaný interaktívny softvérový prototyp. Aplikácia bola vyvinutá v programovacom jazyku Python s využitím frameworku Shiny. Na vizualizáciu dát a štatistické spracovanie boli použité knižnice Pandas, Matplotlib a Seaborn.</w:t>
+      </w:r>
+    </w:p>
+    <w:p>
+      <w:pPr>
+        <w:rPr>
+          <w:lang w:val="en-US"/>
+        </w:rPr>
+      </w:pPr>
+      <w:r>
+        <w:rPr>
+          <w:lang w:val="en-US"/>
+        </w:rPr>
+        <w:t>Prototyp je štruktúrovaný tak, aby umožňoval detailnú klinickú analýzu jednotlivého pacienta, aj globálny pohľad na trendy, rozdelenia a korelácie v rámci celej vyhodnocovanej populácie</w:t>
+      </w:r>
+      <w:r>
+        <w:rPr>
+          <w:lang w:val="en-US"/>
+        </w:rPr>
+        <w:t>.</w:t>
+      </w:r>
+      <w:r>
+        <w:rPr>
+          <w:lang w:val="en-US"/>
+        </w:rPr>
+        <w:t xml:space="preserve"> </w:t>
+      </w:r>
+    </w:p>
+    <w:p>
+      <w:r>
+        <w:t>Používateľské rozhranie je navrhnuté ako viacstránková aplikácia s hornou navigačnou lištou a dvoma nezávislými záložkami. Každá záložka implementuje vlastné bočné menu, čo umožňuje separovať filtre pre individuálnu a skupinovú analýz</w:t>
+      </w:r>
+      <w:r>
+        <w:t>u</w:t>
+      </w:r>
+      <w:r>
+        <w:t>.</w:t>
+      </w:r>
+    </w:p>
+    <w:p>
+      <w:pPr>
+        <w:pStyle w:val="Nadpis2"/>
+      </w:pPr>
+      <w:r>
+        <w:t>Profil pacienta a anomálie</w:t>
+      </w:r>
+    </w:p>
+    <w:p>
+      <w:pPr>
+        <w:numPr>
+          <w:ilvl w:val="0"/>
+          <w:numId w:val="2"/>
+        </w:numPr>
         <w:rPr>
           <w:i/>
           <w:iCs/>
-        </w:rPr>
-      </w:pPr>
+          <w:lang w:val="en-US"/>
+        </w:rPr>
+      </w:pPr>
+      <w:r>
+        <w:rPr>
+          <w:b/>
+          <w:bCs/>
+          <w:i/>
+          <w:iCs/>
+          <w:lang w:val="en-US"/>
+        </w:rPr>
+        <w:t>Bočný panel (Sidebar):</w:t>
+      </w:r>
+      <w:r>
+        <w:rPr>
+          <w:i/>
+          <w:iCs/>
+          <w:lang w:val="en-US"/>
+        </w:rPr>
+        <w:t> Obsahuje vyhľadávacie pole pre rýchly výber pacienta podľa jeho unikátneho identifikátora (Patient_ID).</w:t>
+      </w:r>
     </w:p>
     <w:p>
       <w:pPr>
+        <w:numPr>
+          <w:ilvl w:val="0"/>
+          <w:numId w:val="2"/>
+        </w:numPr>
         <w:rPr>
           <w:i/>
           <w:iCs/>
-        </w:rPr>
-      </w:pPr>
+          <w:lang w:val="en-US"/>
+        </w:rPr>
+      </w:pPr>
+      <w:r>
+        <w:rPr>
+          <w:b/>
+          <w:bCs/>
+          <w:i/>
+          <w:iCs/>
+          <w:lang w:val="en-US"/>
+        </w:rPr>
+        <w:t>Základné demografické informácie:</w:t>
+      </w:r>
+      <w:r>
+        <w:rPr>
+          <w:i/>
+          <w:iCs/>
+          <w:lang w:val="en-US"/>
+        </w:rPr>
+        <w:t> Karta dynamicky prepočítava vek pacienta</w:t>
+      </w:r>
+      <w:r>
+        <w:rPr>
+          <w:i/>
+          <w:iCs/>
+          <w:lang w:val="en-US"/>
+        </w:rPr>
+        <w:t xml:space="preserve"> </w:t>
+      </w:r>
+      <w:r>
+        <w:rPr>
+          <w:i/>
+          <w:iCs/>
+          <w:lang w:val="en-US"/>
+        </w:rPr>
+        <w:t>a zobrazuje sumárne štatistiky: pohlavie, celkový počet realizovaných odberov (návštev), celkový počet nameraných hodnôt, rozsah dátumov odberov a počet sledovaných parametrov.</w:t>
+      </w:r>
     </w:p>
     <w:p>
       <w:pPr>
+        <w:numPr>
+          <w:ilvl w:val="0"/>
+          <w:numId w:val="2"/>
+        </w:numPr>
         <w:rPr>
           <w:i/>
           <w:iCs/>
-        </w:rPr>
-      </w:pPr>
+          <w:lang w:val="en-US"/>
+        </w:rPr>
+      </w:pPr>
+      <w:r>
+        <w:rPr>
+          <w:b/>
+          <w:bCs/>
+          <w:i/>
+          <w:iCs/>
+          <w:lang w:val="en-US"/>
+        </w:rPr>
+        <w:t>Genetický status:</w:t>
+      </w:r>
+      <w:r>
+        <w:rPr>
+          <w:i/>
+          <w:iCs/>
+          <w:lang w:val="en-US"/>
+        </w:rPr>
+        <w:t> Karta vizuálne prezentuje celkový výsledok HFE genetického testovania. Status je farebne rozlíšený podľa závažnosti rizika (červená pre pozitivitu/homozygotnosť, zelená pre negativitu, šedá pre nerealizovaný test).</w:t>
+      </w:r>
+    </w:p>
+    <w:p>
+      <w:pPr>
+        <w:numPr>
+          <w:ilvl w:val="0"/>
+          <w:numId w:val="2"/>
+        </w:numPr>
+        <w:rPr>
+          <w:i/>
+          <w:iCs/>
+          <w:lang w:val="en-US"/>
+        </w:rPr>
+      </w:pPr>
+      <w:r>
+        <w:rPr>
+          <w:i/>
+          <w:iCs/>
+        </w:rPr>
+        <w:lastRenderedPageBreak/>
+        <w:drawing>
+          <wp:anchor distT="0" distB="0" distL="114300" distR="114300" simplePos="0" relativeHeight="251658240" behindDoc="0" locked="0" layoutInCell="1" allowOverlap="1" wp14:anchorId="5C4DAF6F" wp14:editId="505F544F">
+            <wp:simplePos x="0" y="0"/>
+            <wp:positionH relativeFrom="margin">
+              <wp:align>center</wp:align>
+            </wp:positionH>
+            <wp:positionV relativeFrom="paragraph">
+              <wp:posOffset>853804</wp:posOffset>
+            </wp:positionV>
+            <wp:extent cx="6200775" cy="3580130"/>
+            <wp:effectExtent l="0" t="0" r="9525" b="1270"/>
+            <wp:wrapTopAndBottom/>
+            <wp:docPr id="2131552940" name="Obrázok 1"/>
+            <wp:cNvGraphicFramePr>
+              <a:graphicFrameLocks xmlns:a="http://schemas.openxmlformats.org/drawingml/2006/main" noChangeAspect="1"/>
+            </wp:cNvGraphicFramePr>
+            <a:graphic xmlns:a="http://schemas.openxmlformats.org/drawingml/2006/main">
+              <a:graphicData uri="http://schemas.openxmlformats.org/drawingml/2006/picture">
+                <pic:pic xmlns:pic="http://schemas.openxmlformats.org/drawingml/2006/picture">
+                  <pic:nvPicPr>
+                    <pic:cNvPr id="2131552940" name=""/>
+                    <pic:cNvPicPr/>
+                  </pic:nvPicPr>
+                  <pic:blipFill rotWithShape="1">
+                    <a:blip r:embed="rId7" cstate="print">
+                      <a:extLst>
+                        <a:ext uri="{28A0092B-C50C-407E-A947-70E740481C1C}">
+                          <a14:useLocalDpi xmlns:a14="http://schemas.microsoft.com/office/drawing/2010/main" val="0"/>
+                        </a:ext>
+                      </a:extLst>
+                    </a:blip>
+                    <a:srcRect b="36925"/>
+                    <a:stretch>
+                      <a:fillRect/>
+                    </a:stretch>
+                  </pic:blipFill>
+                  <pic:spPr bwMode="auto">
+                    <a:xfrm>
+                      <a:off x="0" y="0"/>
+                      <a:ext cx="6200775" cy="3580130"/>
+                    </a:xfrm>
+                    <a:prstGeom prst="rect">
+                      <a:avLst/>
+                    </a:prstGeom>
+                    <a:ln>
+                      <a:noFill/>
+                    </a:ln>
+                    <a:extLst>
+                      <a:ext uri="{53640926-AAD7-44D8-BBD7-CCE9431645EC}">
+                        <a14:shadowObscured xmlns:a14="http://schemas.microsoft.com/office/drawing/2010/main"/>
+                      </a:ext>
+                    </a:extLst>
+                  </pic:spPr>
+                </pic:pic>
+              </a:graphicData>
+            </a:graphic>
+            <wp14:sizeRelH relativeFrom="margin">
+              <wp14:pctWidth>0</wp14:pctWidth>
+            </wp14:sizeRelH>
+            <wp14:sizeRelV relativeFrom="margin">
+              <wp14:pctHeight>0</wp14:pctHeight>
+            </wp14:sizeRelV>
+          </wp:anchor>
+        </w:drawing>
+      </w:r>
+      <w:r>
+        <w:rPr>
+          <w:b/>
+          <w:bCs/>
+          <w:i/>
+          <w:iCs/>
+          <w:lang w:val="en-US"/>
+        </w:rPr>
+        <w:t>Interaktívna história vyšetrení:</w:t>
+      </w:r>
+      <w:r>
+        <w:rPr>
+          <w:i/>
+          <w:iCs/>
+          <w:lang w:val="en-US"/>
+        </w:rPr>
+        <w:t> </w:t>
+      </w:r>
+      <w:r>
+        <w:rPr>
+          <w:i/>
+          <w:iCs/>
+          <w:lang w:val="en-US"/>
+        </w:rPr>
+        <w:t xml:space="preserve">Pomocou </w:t>
+      </w:r>
+      <w:r>
+        <w:rPr>
+          <w:i/>
+          <w:iCs/>
+          <w:lang w:val="en-US"/>
+        </w:rPr>
+        <w:t xml:space="preserve">komponentu DataTable, </w:t>
+      </w:r>
+      <w:r>
+        <w:rPr>
+          <w:i/>
+          <w:iCs/>
+          <w:lang w:val="en-US"/>
+        </w:rPr>
+        <w:t>aplik</w:t>
+      </w:r>
+      <w:r>
+        <w:rPr>
+          <w:i/>
+          <w:iCs/>
+          <w:lang w:val="sk-SK"/>
+        </w:rPr>
+        <w:t xml:space="preserve">ácia </w:t>
+      </w:r>
+      <w:r>
+        <w:rPr>
+          <w:i/>
+          <w:iCs/>
+          <w:lang w:val="en-US"/>
+        </w:rPr>
+        <w:t>umožňuje priamo v rozhraní vyhľadávať konkrétne vyšetrenia, filtrovať ich podľa hodnôt alebo typu a zoradiť ich chronologicky.</w:t>
+      </w:r>
+    </w:p>
+    <w:p>
+      <w:pPr>
+        <w:pStyle w:val="Nadpis2"/>
+      </w:pPr>
+      <w:r>
+        <w:t>Porovnanie pacienta s populáciou</w:t>
+      </w:r>
+    </w:p>
+    <w:p>
+      <w:r>
+        <w:t>Posledná karta v profile pacienta umožňuje lekárovi zvoliť ľubovoľný laboratórny parameter z ponuky. Systém vygeneruje boxplot distribúcie tohto parametra v celej populácii</w:t>
+      </w:r>
+      <w:r>
+        <w:t>.</w:t>
+      </w:r>
+    </w:p>
+    <w:p>
+      <w:r>
+        <w:rPr>
+          <w:i/>
+          <w:iCs/>
+        </w:rPr>
+        <w:drawing>
+          <wp:anchor distT="0" distB="0" distL="114300" distR="114300" simplePos="0" relativeHeight="251660288" behindDoc="0" locked="0" layoutInCell="1" allowOverlap="1" wp14:anchorId="009EAC95" wp14:editId="2927C8AA">
+            <wp:simplePos x="0" y="0"/>
+            <wp:positionH relativeFrom="margin">
+              <wp:align>right</wp:align>
+            </wp:positionH>
+            <wp:positionV relativeFrom="paragraph">
+              <wp:posOffset>1177177</wp:posOffset>
+            </wp:positionV>
+            <wp:extent cx="5757545" cy="2183765"/>
+            <wp:effectExtent l="0" t="0" r="0" b="6985"/>
+            <wp:wrapTopAndBottom/>
+            <wp:docPr id="1198487112" name="Obrázok 1"/>
+            <wp:cNvGraphicFramePr>
+              <a:graphicFrameLocks xmlns:a="http://schemas.openxmlformats.org/drawingml/2006/main" noChangeAspect="1"/>
+            </wp:cNvGraphicFramePr>
+            <a:graphic xmlns:a="http://schemas.openxmlformats.org/drawingml/2006/main">
+              <a:graphicData uri="http://schemas.openxmlformats.org/drawingml/2006/picture">
+                <pic:pic xmlns:pic="http://schemas.openxmlformats.org/drawingml/2006/picture">
+                  <pic:nvPicPr>
+                    <pic:cNvPr id="2131552940" name=""/>
+                    <pic:cNvPicPr/>
+                  </pic:nvPicPr>
+                  <pic:blipFill rotWithShape="1">
+                    <a:blip r:embed="rId8" cstate="print">
+                      <a:extLst>
+                        <a:ext uri="{28A0092B-C50C-407E-A947-70E740481C1C}">
+                          <a14:useLocalDpi xmlns:a14="http://schemas.microsoft.com/office/drawing/2010/main" val="0"/>
+                        </a:ext>
+                      </a:extLst>
+                    </a:blip>
+                    <a:srcRect l="15330" t="63482" r="1144" b="1902"/>
+                    <a:stretch>
+                      <a:fillRect/>
+                    </a:stretch>
+                  </pic:blipFill>
+                  <pic:spPr bwMode="auto">
+                    <a:xfrm>
+                      <a:off x="0" y="0"/>
+                      <a:ext cx="5757545" cy="2183765"/>
+                    </a:xfrm>
+                    <a:prstGeom prst="rect">
+                      <a:avLst/>
+                    </a:prstGeom>
+                    <a:ln>
+                      <a:noFill/>
+                    </a:ln>
+                    <a:extLst>
+                      <a:ext uri="{53640926-AAD7-44D8-BBD7-CCE9431645EC}">
+                        <a14:shadowObscured xmlns:a14="http://schemas.microsoft.com/office/drawing/2010/main"/>
+                      </a:ext>
+                    </a:extLst>
+                  </pic:spPr>
+                </pic:pic>
+              </a:graphicData>
+            </a:graphic>
+            <wp14:sizeRelH relativeFrom="margin">
+              <wp14:pctWidth>0</wp14:pctWidth>
+            </wp14:sizeRelH>
+            <wp14:sizeRelV relativeFrom="margin">
+              <wp14:pctHeight>0</wp14:pctHeight>
+            </wp14:sizeRelV>
+          </wp:anchor>
+        </w:drawing>
+      </w:r>
+      <w:r>
+        <w:t xml:space="preserve">Následne systém do tohto grafu vykreslí všetky historické merania konkrétneho vybraného pacienta vo forme kontrastných bodov. </w:t>
+      </w:r>
+      <w:r>
+        <w:t>Používateľ</w:t>
+      </w:r>
+      <w:r>
+        <w:t xml:space="preserve"> tak okamžite vidí, v akom kvantile a v akom vzťahu k celkovej populácii sa vybraný jedinec nachádza. Ak je zvolené železo (Železo_S), v grafe sa automaticky zobrazí aj červená prerušovaná línia znázorňujúca kritickú hranicu.</w:t>
+      </w:r>
+    </w:p>
+    <w:p>
+      <w:pPr>
+        <w:rPr>
+          <w:i/>
+          <w:iCs/>
+        </w:rPr>
+      </w:pPr>
+    </w:p>
+    <w:p>
+      <w:pPr>
+        <w:pStyle w:val="Nadpis2"/>
+        <w:rPr>
+          <w:lang w:val="en-US"/>
+        </w:rPr>
+      </w:pPr>
+      <w:r>
+        <w:rPr>
+          <w:lang w:val="en-US"/>
+        </w:rPr>
+        <w:t>Modul: Skupinové vizualizácie a vzťahy</w:t>
+      </w:r>
+    </w:p>
+    <w:p>
+      <w:pPr>
+        <w:rPr>
+          <w:lang w:val="en-US"/>
+        </w:rPr>
+      </w:pPr>
+      <w:r>
+        <w:rPr>
+          <w:lang w:val="en-US"/>
+        </w:rPr>
+        <w:t>Tento modul slúži na výskumné účely, hľadanie trendov v populácii a analýzu vzťahov medzi premennými.</w:t>
+      </w:r>
+    </w:p>
+    <w:p>
+      <w:pPr>
+        <w:numPr>
+          <w:ilvl w:val="0"/>
+          <w:numId w:val="3"/>
+        </w:numPr>
+        <w:rPr>
+          <w:lang w:val="en-US"/>
+        </w:rPr>
+      </w:pPr>
+      <w:r>
+        <w:rPr>
+          <w:b/>
+          <w:bCs/>
+          <w:lang w:val="en-US"/>
+        </w:rPr>
+        <w:t>Bočný panel:</w:t>
+      </w:r>
+      <w:r>
+        <w:rPr>
+          <w:lang w:val="en-US"/>
+        </w:rPr>
+        <w:t> Obsahuje filtre na výber biochemického parametra, typu grafu (Histogram, Boxplot, Boxplot podľa HFE statusu), filtrovanie podľa pohlavia a celkového HFE statusu populácie. Taktiež umožňuje zvoliť nezávislé premenné pre os X a os Y pre scatter plot.</w:t>
+      </w:r>
+    </w:p>
+    <w:p>
+      <w:pPr>
+        <w:numPr>
+          <w:ilvl w:val="0"/>
+          <w:numId w:val="3"/>
+        </w:numPr>
+        <w:rPr>
+          <w:lang w:val="en-US"/>
+        </w:rPr>
+      </w:pPr>
+      <w:r>
+        <w:rPr>
+          <w:b/>
+          <w:bCs/>
+          <w:lang w:val="en-US"/>
+        </w:rPr>
+        <w:t>Prehľadová karta datasetu:</w:t>
+      </w:r>
+      <w:r>
+        <w:rPr>
+          <w:lang w:val="en-US"/>
+        </w:rPr>
+        <w:t> Poskytuje rýchly sumár o celkovom rozsahu dát (celkový počet riadkov, unikátnych pacientov a rôznych typov evidovaných laboratórnych testov).</w:t>
+      </w:r>
+    </w:p>
+    <w:p>
+      <w:pPr>
+        <w:numPr>
+          <w:ilvl w:val="0"/>
+          <w:numId w:val="3"/>
+        </w:numPr>
+        <w:rPr>
+          <w:lang w:val="en-US"/>
+        </w:rPr>
+      </w:pPr>
+      <w:r>
+        <w:rPr>
+          <w:b/>
+          <w:bCs/>
+          <w:lang w:val="en-US"/>
+        </w:rPr>
+        <w:t>Rozdelenie hodnôt vybraného parametra:</w:t>
+      </w:r>
+      <w:r>
+        <w:rPr>
+          <w:lang w:val="en-US"/>
+        </w:rPr>
+        <w:t> Dynamicky vykresľuje rozdelenie hodnôt. Doplnená je o textový štatistický súhrn, ktorý v reálnom čase prepočítava počet záznamov, počet unikátnych pacientov, aritmetický priemer, medián, minimum a maximum pre vybrané filtre.</w:t>
+      </w:r>
+    </w:p>
+    <w:p>
+      <w:pPr>
+        <w:numPr>
+          <w:ilvl w:val="0"/>
+          <w:numId w:val="3"/>
+        </w:numPr>
+        <w:rPr>
+          <w:lang w:val="en-US"/>
+        </w:rPr>
+      </w:pPr>
+      <w:r>
+        <w:rPr>
+          <w:b/>
+          <w:bCs/>
+          <w:lang w:val="en-US"/>
+        </w:rPr>
+        <w:t>Vzťah medzi dvoma parametrami:</w:t>
+      </w:r>
+      <w:r>
+        <w:rPr>
+          <w:lang w:val="en-US"/>
+        </w:rPr>
+        <w:t xml:space="preserve"> Vykresľuje bodový graf. </w:t>
+      </w:r>
+      <w:r>
+        <w:rPr>
+          <w:lang w:val="en-US"/>
+        </w:rPr>
+        <w:t>S</w:t>
+      </w:r>
+      <w:r>
+        <w:rPr>
+          <w:lang w:val="en-US"/>
+        </w:rPr>
+        <w:t>ystém na pozadí realizuje agregáciu dát pomocou pivotovacej tabuľky, čím vypočíta priemerné hodnoty zvolených parametrov X a Y pre každého pacienta individuálne a následne ich vynesie do grafu. To umožňuje sledovať reálne biologické vzťahy bez skreslenia opakovanými meraniami.</w:t>
+      </w:r>
+    </w:p>
+    <w:p>
+      <w:pPr>
+        <w:numPr>
+          <w:ilvl w:val="0"/>
+          <w:numId w:val="3"/>
+        </w:numPr>
+        <w:rPr>
+          <w:lang w:val="en-US"/>
+        </w:rPr>
+      </w:pPr>
+      <w:r>
+        <w:rPr>
+          <w:b/>
+          <w:bCs/>
+          <w:lang w:val="en-US"/>
+        </w:rPr>
+        <w:t>Korelačná heatmapa:</w:t>
+      </w:r>
+      <w:r>
+        <w:rPr>
+          <w:lang w:val="en-US"/>
+        </w:rPr>
+        <w:t> Zobrazuje korelačnú maticu pre kľúčové železité a pečeňové ukazovatele na odhalenie biologických súvislostí (napr. vzťah medzi železom, feritínom a poškodením pečene reprezentovaným enzýmami ALT/AST).</w:t>
+      </w:r>
+    </w:p>
+    <w:p>
+      <w:r>
+        <w:lastRenderedPageBreak/>
+        <w:drawing>
+          <wp:anchor distT="0" distB="0" distL="114300" distR="114300" simplePos="0" relativeHeight="251661312" behindDoc="0" locked="0" layoutInCell="1" allowOverlap="1" wp14:anchorId="5C5A8622" wp14:editId="4B04AD33">
+            <wp:simplePos x="0" y="0"/>
+            <wp:positionH relativeFrom="margin">
+              <wp:posOffset>-596265</wp:posOffset>
+            </wp:positionH>
+            <wp:positionV relativeFrom="paragraph">
+              <wp:posOffset>0</wp:posOffset>
+            </wp:positionV>
+            <wp:extent cx="7021830" cy="5422900"/>
+            <wp:effectExtent l="0" t="0" r="7620" b="6350"/>
+            <wp:wrapTopAndBottom/>
+            <wp:docPr id="709806620" name="Obrázok 1"/>
+            <wp:cNvGraphicFramePr>
+              <a:graphicFrameLocks xmlns:a="http://schemas.openxmlformats.org/drawingml/2006/main" noChangeAspect="1"/>
+            </wp:cNvGraphicFramePr>
+            <a:graphic xmlns:a="http://schemas.openxmlformats.org/drawingml/2006/main">
+              <a:graphicData uri="http://schemas.openxmlformats.org/drawingml/2006/picture">
+                <pic:pic xmlns:pic="http://schemas.openxmlformats.org/drawingml/2006/picture">
+                  <pic:nvPicPr>
+                    <pic:cNvPr id="709806620" name=""/>
+                    <pic:cNvPicPr/>
+                  </pic:nvPicPr>
+                  <pic:blipFill>
+                    <a:blip r:embed="rId9" cstate="print">
+                      <a:extLst>
+                        <a:ext uri="{28A0092B-C50C-407E-A947-70E740481C1C}">
+                          <a14:useLocalDpi xmlns:a14="http://schemas.microsoft.com/office/drawing/2010/main" val="0"/>
+                        </a:ext>
+                      </a:extLst>
+                    </a:blip>
+                    <a:stretch>
+                      <a:fillRect/>
+                    </a:stretch>
+                  </pic:blipFill>
+                  <pic:spPr>
+                    <a:xfrm>
+                      <a:off x="0" y="0"/>
+                      <a:ext cx="7021830" cy="5422900"/>
+                    </a:xfrm>
+                    <a:prstGeom prst="rect">
+                      <a:avLst/>
+                    </a:prstGeom>
+                  </pic:spPr>
+                </pic:pic>
+              </a:graphicData>
+            </a:graphic>
+            <wp14:sizeRelH relativeFrom="margin">
+              <wp14:pctWidth>0</wp14:pctWidth>
+            </wp14:sizeRelH>
+            <wp14:sizeRelV relativeFrom="margin">
+              <wp14:pctHeight>0</wp14:pctHeight>
+            </wp14:sizeRelV>
+          </wp:anchor>
+        </w:drawing>
+      </w:r>
     </w:p>
     <w:sectPr>
-      <w:pgSz w:w="11906" w:h="16838" w:orient="portrait"/>
+      <w:pgSz w:w="11906" w:h="16838"/>
       <w:pgMar w:top="1417" w:right="1417" w:bottom="1417" w:left="1417" w:header="708" w:footer="708" w:gutter="0"/>
       <w:cols w:space="708"/>
       <w:docGrid w:linePitch="360"/>
@@ -3271,12 +3073,316 @@
         <w:ind w:left="360" w:hanging="360"/>
       </w:pPr>
       <w:rPr>
-        <w:rFonts w:hint="default" w:ascii="Symbol" w:hAnsi="Symbol"/>
+        <w:rFonts w:ascii="Symbol" w:hAnsi="Symbol" w:hint="default"/>
+      </w:rPr>
+    </w:lvl>
+  </w:abstractNum>
+  <w:abstractNum w:abstractNumId="1" w15:restartNumberingAfterBreak="0">
+    <w:nsid w:val="3FC939C1"/>
+    <w:multiLevelType w:val="multilevel"/>
+    <w:tmpl w:val="E292869E"/>
+    <w:lvl w:ilvl="0">
+      <w:start w:val="1"/>
+      <w:numFmt w:val="bullet"/>
+      <w:lvlText w:val=""/>
+      <w:lvlJc w:val="left"/>
+      <w:pPr>
+        <w:tabs>
+          <w:tab w:val="num" w:pos="720"/>
+        </w:tabs>
+        <w:ind w:left="720" w:hanging="360"/>
+      </w:pPr>
+      <w:rPr>
+        <w:rFonts w:ascii="Symbol" w:hAnsi="Symbol" w:hint="default"/>
+        <w:sz w:val="20"/>
+      </w:rPr>
+    </w:lvl>
+    <w:lvl w:ilvl="1" w:tentative="1">
+      <w:start w:val="1"/>
+      <w:numFmt w:val="bullet"/>
+      <w:lvlText w:val="o"/>
+      <w:lvlJc w:val="left"/>
+      <w:pPr>
+        <w:tabs>
+          <w:tab w:val="num" w:pos="1440"/>
+        </w:tabs>
+        <w:ind w:left="1440" w:hanging="360"/>
+      </w:pPr>
+      <w:rPr>
+        <w:rFonts w:ascii="Courier New" w:hAnsi="Courier New" w:hint="default"/>
+        <w:sz w:val="20"/>
+      </w:rPr>
+    </w:lvl>
+    <w:lvl w:ilvl="2" w:tentative="1">
+      <w:start w:val="1"/>
+      <w:numFmt w:val="bullet"/>
+      <w:lvlText w:val=""/>
+      <w:lvlJc w:val="left"/>
+      <w:pPr>
+        <w:tabs>
+          <w:tab w:val="num" w:pos="2160"/>
+        </w:tabs>
+        <w:ind w:left="2160" w:hanging="360"/>
+      </w:pPr>
+      <w:rPr>
+        <w:rFonts w:ascii="Wingdings" w:hAnsi="Wingdings" w:hint="default"/>
+        <w:sz w:val="20"/>
+      </w:rPr>
+    </w:lvl>
+    <w:lvl w:ilvl="3" w:tentative="1">
+      <w:start w:val="1"/>
+      <w:numFmt w:val="bullet"/>
+      <w:lvlText w:val=""/>
+      <w:lvlJc w:val="left"/>
+      <w:pPr>
+        <w:tabs>
+          <w:tab w:val="num" w:pos="2880"/>
+        </w:tabs>
+        <w:ind w:left="2880" w:hanging="360"/>
+      </w:pPr>
+      <w:rPr>
+        <w:rFonts w:ascii="Wingdings" w:hAnsi="Wingdings" w:hint="default"/>
+        <w:sz w:val="20"/>
+      </w:rPr>
+    </w:lvl>
+    <w:lvl w:ilvl="4" w:tentative="1">
+      <w:start w:val="1"/>
+      <w:numFmt w:val="bullet"/>
+      <w:lvlText w:val=""/>
+      <w:lvlJc w:val="left"/>
+      <w:pPr>
+        <w:tabs>
+          <w:tab w:val="num" w:pos="3600"/>
+        </w:tabs>
+        <w:ind w:left="3600" w:hanging="360"/>
+      </w:pPr>
+      <w:rPr>
+        <w:rFonts w:ascii="Wingdings" w:hAnsi="Wingdings" w:hint="default"/>
+        <w:sz w:val="20"/>
+      </w:rPr>
+    </w:lvl>
+    <w:lvl w:ilvl="5" w:tentative="1">
+      <w:start w:val="1"/>
+      <w:numFmt w:val="bullet"/>
+      <w:lvlText w:val=""/>
+      <w:lvlJc w:val="left"/>
+      <w:pPr>
+        <w:tabs>
+          <w:tab w:val="num" w:pos="4320"/>
+        </w:tabs>
+        <w:ind w:left="4320" w:hanging="360"/>
+      </w:pPr>
+      <w:rPr>
+        <w:rFonts w:ascii="Wingdings" w:hAnsi="Wingdings" w:hint="default"/>
+        <w:sz w:val="20"/>
+      </w:rPr>
+    </w:lvl>
+    <w:lvl w:ilvl="6" w:tentative="1">
+      <w:start w:val="1"/>
+      <w:numFmt w:val="bullet"/>
+      <w:lvlText w:val=""/>
+      <w:lvlJc w:val="left"/>
+      <w:pPr>
+        <w:tabs>
+          <w:tab w:val="num" w:pos="5040"/>
+        </w:tabs>
+        <w:ind w:left="5040" w:hanging="360"/>
+      </w:pPr>
+      <w:rPr>
+        <w:rFonts w:ascii="Wingdings" w:hAnsi="Wingdings" w:hint="default"/>
+        <w:sz w:val="20"/>
+      </w:rPr>
+    </w:lvl>
+    <w:lvl w:ilvl="7" w:tentative="1">
+      <w:start w:val="1"/>
+      <w:numFmt w:val="bullet"/>
+      <w:lvlText w:val=""/>
+      <w:lvlJc w:val="left"/>
+      <w:pPr>
+        <w:tabs>
+          <w:tab w:val="num" w:pos="5760"/>
+        </w:tabs>
+        <w:ind w:left="5760" w:hanging="360"/>
+      </w:pPr>
+      <w:rPr>
+        <w:rFonts w:ascii="Wingdings" w:hAnsi="Wingdings" w:hint="default"/>
+        <w:sz w:val="20"/>
+      </w:rPr>
+    </w:lvl>
+    <w:lvl w:ilvl="8" w:tentative="1">
+      <w:start w:val="1"/>
+      <w:numFmt w:val="bullet"/>
+      <w:lvlText w:val=""/>
+      <w:lvlJc w:val="left"/>
+      <w:pPr>
+        <w:tabs>
+          <w:tab w:val="num" w:pos="6480"/>
+        </w:tabs>
+        <w:ind w:left="6480" w:hanging="360"/>
+      </w:pPr>
+      <w:rPr>
+        <w:rFonts w:ascii="Wingdings" w:hAnsi="Wingdings" w:hint="default"/>
+        <w:sz w:val="20"/>
+      </w:rPr>
+    </w:lvl>
+  </w:abstractNum>
+  <w:abstractNum w:abstractNumId="2" w15:restartNumberingAfterBreak="0">
+    <w:nsid w:val="69A519F8"/>
+    <w:multiLevelType w:val="multilevel"/>
+    <w:tmpl w:val="03C4CF00"/>
+    <w:lvl w:ilvl="0">
+      <w:start w:val="1"/>
+      <w:numFmt w:val="bullet"/>
+      <w:lvlText w:val=""/>
+      <w:lvlJc w:val="left"/>
+      <w:pPr>
+        <w:tabs>
+          <w:tab w:val="num" w:pos="720"/>
+        </w:tabs>
+        <w:ind w:left="720" w:hanging="360"/>
+      </w:pPr>
+      <w:rPr>
+        <w:rFonts w:ascii="Symbol" w:hAnsi="Symbol" w:hint="default"/>
+        <w:sz w:val="20"/>
+      </w:rPr>
+    </w:lvl>
+    <w:lvl w:ilvl="1" w:tentative="1">
+      <w:start w:val="1"/>
+      <w:numFmt w:val="bullet"/>
+      <w:lvlText w:val="o"/>
+      <w:lvlJc w:val="left"/>
+      <w:pPr>
+        <w:tabs>
+          <w:tab w:val="num" w:pos="1440"/>
+        </w:tabs>
+        <w:ind w:left="1440" w:hanging="360"/>
+      </w:pPr>
+      <w:rPr>
+        <w:rFonts w:ascii="Courier New" w:hAnsi="Courier New" w:hint="default"/>
+        <w:sz w:val="20"/>
+      </w:rPr>
+    </w:lvl>
+    <w:lvl w:ilvl="2" w:tentative="1">
+      <w:start w:val="1"/>
+      <w:numFmt w:val="bullet"/>
+      <w:lvlText w:val=""/>
+      <w:lvlJc w:val="left"/>
+      <w:pPr>
+        <w:tabs>
+          <w:tab w:val="num" w:pos="2160"/>
+        </w:tabs>
+        <w:ind w:left="2160" w:hanging="360"/>
+      </w:pPr>
+      <w:rPr>
+        <w:rFonts w:ascii="Wingdings" w:hAnsi="Wingdings" w:hint="default"/>
+        <w:sz w:val="20"/>
+      </w:rPr>
+    </w:lvl>
+    <w:lvl w:ilvl="3" w:tentative="1">
+      <w:start w:val="1"/>
+      <w:numFmt w:val="bullet"/>
+      <w:lvlText w:val=""/>
+      <w:lvlJc w:val="left"/>
+      <w:pPr>
+        <w:tabs>
+          <w:tab w:val="num" w:pos="2880"/>
+        </w:tabs>
+        <w:ind w:left="2880" w:hanging="360"/>
+      </w:pPr>
+      <w:rPr>
+        <w:rFonts w:ascii="Wingdings" w:hAnsi="Wingdings" w:hint="default"/>
+        <w:sz w:val="20"/>
+      </w:rPr>
+    </w:lvl>
+    <w:lvl w:ilvl="4" w:tentative="1">
+      <w:start w:val="1"/>
+      <w:numFmt w:val="bullet"/>
+      <w:lvlText w:val=""/>
+      <w:lvlJc w:val="left"/>
+      <w:pPr>
+        <w:tabs>
+          <w:tab w:val="num" w:pos="3600"/>
+        </w:tabs>
+        <w:ind w:left="3600" w:hanging="360"/>
+      </w:pPr>
+      <w:rPr>
+        <w:rFonts w:ascii="Wingdings" w:hAnsi="Wingdings" w:hint="default"/>
+        <w:sz w:val="20"/>
+      </w:rPr>
+    </w:lvl>
+    <w:lvl w:ilvl="5" w:tentative="1">
+      <w:start w:val="1"/>
+      <w:numFmt w:val="bullet"/>
+      <w:lvlText w:val=""/>
+      <w:lvlJc w:val="left"/>
+      <w:pPr>
+        <w:tabs>
+          <w:tab w:val="num" w:pos="4320"/>
+        </w:tabs>
+        <w:ind w:left="4320" w:hanging="360"/>
+      </w:pPr>
+      <w:rPr>
+        <w:rFonts w:ascii="Wingdings" w:hAnsi="Wingdings" w:hint="default"/>
+        <w:sz w:val="20"/>
+      </w:rPr>
+    </w:lvl>
+    <w:lvl w:ilvl="6" w:tentative="1">
+      <w:start w:val="1"/>
+      <w:numFmt w:val="bullet"/>
+      <w:lvlText w:val=""/>
+      <w:lvlJc w:val="left"/>
+      <w:pPr>
+        <w:tabs>
+          <w:tab w:val="num" w:pos="5040"/>
+        </w:tabs>
+        <w:ind w:left="5040" w:hanging="360"/>
+      </w:pPr>
+      <w:rPr>
+        <w:rFonts w:ascii="Wingdings" w:hAnsi="Wingdings" w:hint="default"/>
+        <w:sz w:val="20"/>
+      </w:rPr>
+    </w:lvl>
+    <w:lvl w:ilvl="7" w:tentative="1">
+      <w:start w:val="1"/>
+      <w:numFmt w:val="bullet"/>
+      <w:lvlText w:val=""/>
+      <w:lvlJc w:val="left"/>
+      <w:pPr>
+        <w:tabs>
+          <w:tab w:val="num" w:pos="5760"/>
+        </w:tabs>
+        <w:ind w:left="5760" w:hanging="360"/>
+      </w:pPr>
+      <w:rPr>
+        <w:rFonts w:ascii="Wingdings" w:hAnsi="Wingdings" w:hint="default"/>
+        <w:sz w:val="20"/>
+      </w:rPr>
+    </w:lvl>
+    <w:lvl w:ilvl="8" w:tentative="1">
+      <w:start w:val="1"/>
+      <w:numFmt w:val="bullet"/>
+      <w:lvlText w:val=""/>
+      <w:lvlJc w:val="left"/>
+      <w:pPr>
+        <w:tabs>
+          <w:tab w:val="num" w:pos="6480"/>
+        </w:tabs>
+        <w:ind w:left="6480" w:hanging="360"/>
+      </w:pPr>
+      <w:rPr>
+        <w:rFonts w:ascii="Wingdings" w:hAnsi="Wingdings" w:hint="default"/>
+        <w:sz w:val="20"/>
       </w:rPr>
     </w:lvl>
   </w:abstractNum>
   <w:num w:numId="1" w16cid:durableId="466553847">
     <w:abstractNumId w:val="0"/>
+  </w:num>
+  <w:num w:numId="2" w16cid:durableId="1545750561">
+    <w:abstractNumId w:val="2"/>
+  </w:num>
+  <w:num w:numId="3" w16cid:durableId="1786582541">
+    <w:abstractNumId w:val="1"/>
   </w:num>
 </w:numbering>
 </file>
@@ -3286,7 +3392,7 @@
   <w:docDefaults>
     <w:rPrDefault>
       <w:rPr>
-        <w:rFonts w:asciiTheme="minorHAnsi" w:hAnsiTheme="minorHAnsi" w:eastAsiaTheme="minorHAnsi" w:cstheme="minorBidi"/>
+        <w:rFonts w:asciiTheme="minorHAnsi" w:eastAsiaTheme="minorHAnsi" w:hAnsiTheme="minorHAnsi" w:cstheme="minorBidi"/>
         <w:kern w:val="2"/>
         <w:sz w:val="22"/>
         <w:szCs w:val="22"/>
@@ -3303,14 +3409,14 @@
   <w:latentStyles w:defLockedState="0" w:defUIPriority="99" w:defSemiHidden="0" w:defUnhideWhenUsed="0" w:defQFormat="0" w:count="376">
     <w:lsdException w:name="Normal" w:uiPriority="0" w:qFormat="1"/>
     <w:lsdException w:name="heading 1" w:uiPriority="9" w:qFormat="1"/>
-    <w:lsdException w:name="heading 2" w:uiPriority="9" w:semiHidden="1" w:unhideWhenUsed="1" w:qFormat="1"/>
-    <w:lsdException w:name="heading 3" w:uiPriority="9" w:semiHidden="1" w:unhideWhenUsed="1" w:qFormat="1"/>
-    <w:lsdException w:name="heading 4" w:uiPriority="9" w:semiHidden="1" w:unhideWhenUsed="1" w:qFormat="1"/>
-    <w:lsdException w:name="heading 5" w:uiPriority="9" w:semiHidden="1" w:unhideWhenUsed="1" w:qFormat="1"/>
-    <w:lsdException w:name="heading 6" w:uiPriority="9" w:semiHidden="1" w:unhideWhenUsed="1" w:qFormat="1"/>
-    <w:lsdException w:name="heading 7" w:uiPriority="9" w:semiHidden="1" w:unhideWhenUsed="1" w:qFormat="1"/>
-    <w:lsdException w:name="heading 8" w:uiPriority="9" w:semiHidden="1" w:unhideWhenUsed="1" w:qFormat="1"/>
-    <w:lsdException w:name="heading 9" w:uiPriority="9" w:semiHidden="1" w:unhideWhenUsed="1" w:qFormat="1"/>
+    <w:lsdException w:name="heading 2" w:semiHidden="1" w:uiPriority="9" w:unhideWhenUsed="1" w:qFormat="1"/>
+    <w:lsdException w:name="heading 3" w:semiHidden="1" w:uiPriority="9" w:unhideWhenUsed="1" w:qFormat="1"/>
+    <w:lsdException w:name="heading 4" w:semiHidden="1" w:uiPriority="9" w:unhideWhenUsed="1" w:qFormat="1"/>
+    <w:lsdException w:name="heading 5" w:semiHidden="1" w:uiPriority="9" w:unhideWhenUsed="1" w:qFormat="1"/>
+    <w:lsdException w:name="heading 6" w:semiHidden="1" w:uiPriority="9" w:unhideWhenUsed="1" w:qFormat="1"/>
+    <w:lsdException w:name="heading 7" w:semiHidden="1" w:uiPriority="9" w:unhideWhenUsed="1" w:qFormat="1"/>
+    <w:lsdException w:name="heading 8" w:semiHidden="1" w:uiPriority="9" w:unhideWhenUsed="1" w:qFormat="1"/>
+    <w:lsdException w:name="heading 9" w:semiHidden="1" w:uiPriority="9" w:unhideWhenUsed="1" w:qFormat="1"/>
     <w:lsdException w:name="index 1" w:semiHidden="1" w:unhideWhenUsed="1"/>
     <w:lsdException w:name="index 2" w:semiHidden="1" w:unhideWhenUsed="1"/>
     <w:lsdException w:name="index 3" w:semiHidden="1" w:unhideWhenUsed="1"/>
@@ -3320,22 +3426,22 @@
     <w:lsdException w:name="index 7" w:semiHidden="1" w:unhideWhenUsed="1"/>
     <w:lsdException w:name="index 8" w:semiHidden="1" w:unhideWhenUsed="1"/>
     <w:lsdException w:name="index 9" w:semiHidden="1" w:unhideWhenUsed="1"/>
-    <w:lsdException w:name="toc 1" w:uiPriority="39" w:semiHidden="1" w:unhideWhenUsed="1"/>
-    <w:lsdException w:name="toc 2" w:uiPriority="39" w:semiHidden="1" w:unhideWhenUsed="1"/>
-    <w:lsdException w:name="toc 3" w:uiPriority="39" w:semiHidden="1" w:unhideWhenUsed="1"/>
-    <w:lsdException w:name="toc 4" w:uiPriority="39" w:semiHidden="1" w:unhideWhenUsed="1"/>
-    <w:lsdException w:name="toc 5" w:uiPriority="39" w:semiHidden="1" w:unhideWhenUsed="1"/>
-    <w:lsdException w:name="toc 6" w:uiPriority="39" w:semiHidden="1" w:unhideWhenUsed="1"/>
-    <w:lsdException w:name="toc 7" w:uiPriority="39" w:semiHidden="1" w:unhideWhenUsed="1"/>
-    <w:lsdException w:name="toc 8" w:uiPriority="39" w:semiHidden="1" w:unhideWhenUsed="1"/>
-    <w:lsdException w:name="toc 9" w:uiPriority="39" w:semiHidden="1" w:unhideWhenUsed="1"/>
+    <w:lsdException w:name="toc 1" w:semiHidden="1" w:uiPriority="39" w:unhideWhenUsed="1"/>
+    <w:lsdException w:name="toc 2" w:semiHidden="1" w:uiPriority="39" w:unhideWhenUsed="1"/>
+    <w:lsdException w:name="toc 3" w:semiHidden="1" w:uiPriority="39" w:unhideWhenUsed="1"/>
+    <w:lsdException w:name="toc 4" w:semiHidden="1" w:uiPriority="39" w:unhideWhenUsed="1"/>
+    <w:lsdException w:name="toc 5" w:semiHidden="1" w:uiPriority="39" w:unhideWhenUsed="1"/>
+    <w:lsdException w:name="toc 6" w:semiHidden="1" w:uiPriority="39" w:unhideWhenUsed="1"/>
+    <w:lsdException w:name="toc 7" w:semiHidden="1" w:uiPriority="39" w:unhideWhenUsed="1"/>
+    <w:lsdException w:name="toc 8" w:semiHidden="1" w:uiPriority="39" w:unhideWhenUsed="1"/>
+    <w:lsdException w:name="toc 9" w:semiHidden="1" w:uiPriority="39" w:unhideWhenUsed="1"/>
     <w:lsdException w:name="Normal Indent" w:semiHidden="1" w:unhideWhenUsed="1"/>
     <w:lsdException w:name="footnote text" w:semiHidden="1" w:unhideWhenUsed="1"/>
     <w:lsdException w:name="annotation text" w:semiHidden="1" w:unhideWhenUsed="1"/>
     <w:lsdException w:name="header" w:semiHidden="1" w:unhideWhenUsed="1"/>
     <w:lsdException w:name="footer" w:semiHidden="1" w:unhideWhenUsed="1"/>
     <w:lsdException w:name="index heading" w:semiHidden="1" w:unhideWhenUsed="1"/>
-    <w:lsdException w:name="caption" w:uiPriority="35" w:semiHidden="1" w:unhideWhenUsed="1" w:qFormat="1"/>
+    <w:lsdException w:name="caption" w:semiHidden="1" w:uiPriority="35" w:unhideWhenUsed="1" w:qFormat="1"/>
     <w:lsdException w:name="table of figures" w:semiHidden="1" w:unhideWhenUsed="1"/>
     <w:lsdException w:name="envelope address" w:semiHidden="1" w:unhideWhenUsed="1"/>
     <w:lsdException w:name="envelope return" w:semiHidden="1" w:unhideWhenUsed="1"/>
@@ -3366,7 +3472,7 @@
     <w:lsdException w:name="Title" w:uiPriority="10" w:qFormat="1"/>
     <w:lsdException w:name="Closing" w:semiHidden="1" w:unhideWhenUsed="1"/>
     <w:lsdException w:name="Signature" w:semiHidden="1" w:unhideWhenUsed="1"/>
-    <w:lsdException w:name="Default Paragraph Font" w:uiPriority="1" w:semiHidden="1" w:unhideWhenUsed="1"/>
+    <w:lsdException w:name="Default Paragraph Font" w:semiHidden="1" w:uiPriority="1" w:unhideWhenUsed="1"/>
     <w:lsdException w:name="Body Text" w:semiHidden="1" w:unhideWhenUsed="1"/>
     <w:lsdException w:name="Body Text Indent" w:semiHidden="1" w:unhideWhenUsed="1"/>
     <w:lsdException w:name="List Continue" w:semiHidden="1" w:unhideWhenUsed="1"/>
@@ -3566,8 +3672,8 @@
     <w:lsdException w:name="Subtle Reference" w:uiPriority="31" w:qFormat="1"/>
     <w:lsdException w:name="Intense Reference" w:uiPriority="32" w:qFormat="1"/>
     <w:lsdException w:name="Book Title" w:uiPriority="33" w:qFormat="1"/>
-    <w:lsdException w:name="Bibliography" w:uiPriority="37" w:semiHidden="1" w:unhideWhenUsed="1"/>
-    <w:lsdException w:name="TOC Heading" w:uiPriority="39" w:semiHidden="1" w:unhideWhenUsed="1" w:qFormat="1"/>
+    <w:lsdException w:name="Bibliography" w:semiHidden="1" w:uiPriority="37" w:unhideWhenUsed="1"/>
+    <w:lsdException w:name="TOC Heading" w:semiHidden="1" w:uiPriority="39" w:unhideWhenUsed="1" w:qFormat="1"/>
     <w:lsdException w:name="Plain Table 1" w:uiPriority="41"/>
     <w:lsdException w:name="Plain Table 2" w:uiPriority="42"/>
     <w:lsdException w:name="Plain Table 3" w:uiPriority="43"/>
@@ -3678,7 +3784,7 @@
     <w:lsdException w:name="Unresolved Mention" w:semiHidden="1" w:unhideWhenUsed="1"/>
     <w:lsdException w:name="Smart Link" w:semiHidden="1" w:unhideWhenUsed="1"/>
   </w:latentStyles>
-  <w:style w:type="paragraph" w:styleId="Normlny" w:default="1">
+  <w:style w:type="paragraph" w:default="1" w:styleId="Normlny">
     <w:name w:val="Normal"/>
     <w:qFormat/>
     <w:rsid w:val="00226EEE"/>
@@ -3687,10 +3793,11 @@
       <w:jc w:val="both"/>
     </w:pPr>
     <w:rPr>
-      <w:rFonts w:ascii="Arial" w:hAnsi="Arial" w:eastAsia="Times New Roman" w:cs="Times New Roman"/>
+      <w:rFonts w:ascii="Arial" w:eastAsia="Times New Roman" w:hAnsi="Arial" w:cs="Times New Roman"/>
+      <w:noProof/>
       <w:kern w:val="0"/>
       <w:szCs w:val="24"/>
-      <w:lang w:eastAsia="sk-SK"/>
+      <w:lang w:val="en-GB" w:eastAsia="sk-SK"/>
       <w14:ligatures w14:val="none"/>
     </w:rPr>
   </w:style>
@@ -3709,7 +3816,7 @@
       <w:outlineLvl w:val="0"/>
     </w:pPr>
     <w:rPr>
-      <w:rFonts w:asciiTheme="majorHAnsi" w:hAnsiTheme="majorHAnsi" w:eastAsiaTheme="majorEastAsia" w:cstheme="majorBidi"/>
+      <w:rFonts w:asciiTheme="majorHAnsi" w:eastAsiaTheme="majorEastAsia" w:hAnsiTheme="majorHAnsi" w:cstheme="majorBidi"/>
       <w:color w:val="2F5496" w:themeColor="accent1" w:themeShade="BF"/>
       <w:sz w:val="40"/>
       <w:szCs w:val="40"/>
@@ -3721,7 +3828,6 @@
     <w:next w:val="Normlny"/>
     <w:link w:val="Nadpis2Char"/>
     <w:uiPriority w:val="9"/>
-    <w:semiHidden/>
     <w:unhideWhenUsed/>
     <w:qFormat/>
     <w:rsid w:val="004D0BBE"/>
@@ -3732,7 +3838,7 @@
       <w:outlineLvl w:val="1"/>
     </w:pPr>
     <w:rPr>
-      <w:rFonts w:asciiTheme="majorHAnsi" w:hAnsiTheme="majorHAnsi" w:eastAsiaTheme="majorEastAsia" w:cstheme="majorBidi"/>
+      <w:rFonts w:asciiTheme="majorHAnsi" w:eastAsiaTheme="majorEastAsia" w:hAnsiTheme="majorHAnsi" w:cstheme="majorBidi"/>
       <w:color w:val="2F5496" w:themeColor="accent1" w:themeShade="BF"/>
       <w:sz w:val="32"/>
       <w:szCs w:val="32"/>
@@ -3891,13 +3997,12 @@
       <w:color w:val="272727" w:themeColor="text1" w:themeTint="D8"/>
     </w:rPr>
   </w:style>
-  <w:style w:type="character" w:styleId="Predvolenpsmoodseku" w:default="1">
+  <w:style w:type="character" w:default="1" w:styleId="Predvolenpsmoodseku">
     <w:name w:val="Default Paragraph Font"/>
     <w:uiPriority w:val="1"/>
-    <w:semiHidden/>
     <w:unhideWhenUsed/>
   </w:style>
-  <w:style w:type="table" w:styleId="Normlnatabuka" w:default="1">
+  <w:style w:type="table" w:default="1" w:styleId="Normlnatabuka">
     <w:name w:val="Normal Table"/>
     <w:uiPriority w:val="99"/>
     <w:semiHidden/>
@@ -3912,40 +4017,39 @@
       </w:tblCellMar>
     </w:tblPr>
   </w:style>
-  <w:style w:type="numbering" w:styleId="Bezzoznamu" w:default="1">
+  <w:style w:type="numbering" w:default="1" w:styleId="Bezzoznamu">
     <w:name w:val="No List"/>
     <w:uiPriority w:val="99"/>
     <w:semiHidden/>
     <w:unhideWhenUsed/>
   </w:style>
-  <w:style w:type="character" w:styleId="Nadpis1Char" w:customStyle="1">
+  <w:style w:type="character" w:customStyle="1" w:styleId="Nadpis1Char">
     <w:name w:val="Nadpis 1 Char"/>
     <w:basedOn w:val="Predvolenpsmoodseku"/>
     <w:link w:val="Nadpis1"/>
     <w:uiPriority w:val="9"/>
     <w:rsid w:val="004D0BBE"/>
     <w:rPr>
-      <w:rFonts w:asciiTheme="majorHAnsi" w:hAnsiTheme="majorHAnsi" w:eastAsiaTheme="majorEastAsia" w:cstheme="majorBidi"/>
+      <w:rFonts w:asciiTheme="majorHAnsi" w:eastAsiaTheme="majorEastAsia" w:hAnsiTheme="majorHAnsi" w:cstheme="majorBidi"/>
       <w:color w:val="2F5496" w:themeColor="accent1" w:themeShade="BF"/>
       <w:sz w:val="40"/>
       <w:szCs w:val="40"/>
     </w:rPr>
   </w:style>
-  <w:style w:type="character" w:styleId="Nadpis2Char" w:customStyle="1">
+  <w:style w:type="character" w:customStyle="1" w:styleId="Nadpis2Char">
     <w:name w:val="Nadpis 2 Char"/>
     <w:basedOn w:val="Predvolenpsmoodseku"/>
     <w:link w:val="Nadpis2"/>
     <w:uiPriority w:val="9"/>
-    <w:semiHidden/>
     <w:rsid w:val="004D0BBE"/>
     <w:rPr>
-      <w:rFonts w:asciiTheme="majorHAnsi" w:hAnsiTheme="majorHAnsi" w:eastAsiaTheme="majorEastAsia" w:cstheme="majorBidi"/>
+      <w:rFonts w:asciiTheme="majorHAnsi" w:eastAsiaTheme="majorEastAsia" w:hAnsiTheme="majorHAnsi" w:cstheme="majorBidi"/>
       <w:color w:val="2F5496" w:themeColor="accent1" w:themeShade="BF"/>
       <w:sz w:val="32"/>
       <w:szCs w:val="32"/>
     </w:rPr>
   </w:style>
-  <w:style w:type="character" w:styleId="Nadpis3Char" w:customStyle="1">
+  <w:style w:type="character" w:customStyle="1" w:styleId="Nadpis3Char">
     <w:name w:val="Nadpis 3 Char"/>
     <w:basedOn w:val="Predvolenpsmoodseku"/>
     <w:link w:val="Nadpis3"/>
@@ -3959,7 +4063,7 @@
       <w:szCs w:val="28"/>
     </w:rPr>
   </w:style>
-  <w:style w:type="character" w:styleId="Nadpis4Char" w:customStyle="1">
+  <w:style w:type="character" w:customStyle="1" w:styleId="Nadpis4Char">
     <w:name w:val="Nadpis 4 Char"/>
     <w:basedOn w:val="Predvolenpsmoodseku"/>
     <w:link w:val="Nadpis4"/>
@@ -3973,7 +4077,7 @@
       <w:color w:val="2F5496" w:themeColor="accent1" w:themeShade="BF"/>
     </w:rPr>
   </w:style>
-  <w:style w:type="character" w:styleId="Nadpis5Char" w:customStyle="1">
+  <w:style w:type="character" w:customStyle="1" w:styleId="Nadpis5Char">
     <w:name w:val="Nadpis 5 Char"/>
     <w:basedOn w:val="Predvolenpsmoodseku"/>
     <w:link w:val="Nadpis5"/>
@@ -3985,7 +4089,7 @@
       <w:color w:val="2F5496" w:themeColor="accent1" w:themeShade="BF"/>
     </w:rPr>
   </w:style>
-  <w:style w:type="character" w:styleId="Nadpis6Char" w:customStyle="1">
+  <w:style w:type="character" w:customStyle="1" w:styleId="Nadpis6Char">
     <w:name w:val="Nadpis 6 Char"/>
     <w:basedOn w:val="Predvolenpsmoodseku"/>
     <w:link w:val="Nadpis6"/>
@@ -3999,7 +4103,7 @@
       <w:color w:val="595959" w:themeColor="text1" w:themeTint="A6"/>
     </w:rPr>
   </w:style>
-  <w:style w:type="character" w:styleId="Nadpis7Char" w:customStyle="1">
+  <w:style w:type="character" w:customStyle="1" w:styleId="Nadpis7Char">
     <w:name w:val="Nadpis 7 Char"/>
     <w:basedOn w:val="Predvolenpsmoodseku"/>
     <w:link w:val="Nadpis7"/>
@@ -4011,7 +4115,7 @@
       <w:color w:val="595959" w:themeColor="text1" w:themeTint="A6"/>
     </w:rPr>
   </w:style>
-  <w:style w:type="character" w:styleId="Nadpis8Char" w:customStyle="1">
+  <w:style w:type="character" w:customStyle="1" w:styleId="Nadpis8Char">
     <w:name w:val="Nadpis 8 Char"/>
     <w:basedOn w:val="Predvolenpsmoodseku"/>
     <w:link w:val="Nadpis8"/>
@@ -4025,7 +4129,7 @@
       <w:color w:val="272727" w:themeColor="text1" w:themeTint="D8"/>
     </w:rPr>
   </w:style>
-  <w:style w:type="character" w:styleId="Nadpis9Char" w:customStyle="1">
+  <w:style w:type="character" w:customStyle="1" w:styleId="Nadpis9Char">
     <w:name w:val="Nadpis 9 Char"/>
     <w:basedOn w:val="Predvolenpsmoodseku"/>
     <w:link w:val="Nadpis9"/>
@@ -4050,21 +4154,21 @@
       <w:contextualSpacing/>
     </w:pPr>
     <w:rPr>
-      <w:rFonts w:asciiTheme="majorHAnsi" w:hAnsiTheme="majorHAnsi" w:eastAsiaTheme="majorEastAsia" w:cstheme="majorBidi"/>
+      <w:rFonts w:asciiTheme="majorHAnsi" w:eastAsiaTheme="majorEastAsia" w:hAnsiTheme="majorHAnsi" w:cstheme="majorBidi"/>
       <w:spacing w:val="-10"/>
       <w:kern w:val="28"/>
       <w:sz w:val="56"/>
       <w:szCs w:val="56"/>
     </w:rPr>
   </w:style>
-  <w:style w:type="character" w:styleId="NzovChar" w:customStyle="1">
+  <w:style w:type="character" w:customStyle="1" w:styleId="NzovChar">
     <w:name w:val="Názov Char"/>
     <w:basedOn w:val="Predvolenpsmoodseku"/>
     <w:link w:val="Nzov"/>
     <w:uiPriority w:val="10"/>
     <w:rsid w:val="004D0BBE"/>
     <w:rPr>
-      <w:rFonts w:asciiTheme="majorHAnsi" w:hAnsiTheme="majorHAnsi" w:eastAsiaTheme="majorEastAsia" w:cstheme="majorBidi"/>
+      <w:rFonts w:asciiTheme="majorHAnsi" w:eastAsiaTheme="majorEastAsia" w:hAnsiTheme="majorHAnsi" w:cstheme="majorBidi"/>
       <w:spacing w:val="-10"/>
       <w:kern w:val="28"/>
       <w:sz w:val="56"/>
@@ -4092,7 +4196,7 @@
       <w:szCs w:val="28"/>
     </w:rPr>
   </w:style>
-  <w:style w:type="character" w:styleId="PodtitulChar" w:customStyle="1">
+  <w:style w:type="character" w:customStyle="1" w:styleId="PodtitulChar">
     <w:name w:val="Podtitul Char"/>
     <w:basedOn w:val="Predvolenpsmoodseku"/>
     <w:link w:val="Podtitul"/>
@@ -4124,7 +4228,7 @@
       <w:color w:val="404040" w:themeColor="text1" w:themeTint="BF"/>
     </w:rPr>
   </w:style>
-  <w:style w:type="character" w:styleId="CitciaChar" w:customStyle="1">
+  <w:style w:type="character" w:customStyle="1" w:styleId="CitciaChar">
     <w:name w:val="Citácia Char"/>
     <w:basedOn w:val="Predvolenpsmoodseku"/>
     <w:link w:val="Citcia"/>
@@ -4169,8 +4273,8 @@
     <w:rsid w:val="004D0BBE"/>
     <w:pPr>
       <w:pBdr>
-        <w:top w:val="single" w:color="2F5496" w:themeColor="accent1" w:themeShade="BF" w:sz="4" w:space="10"/>
-        <w:bottom w:val="single" w:color="2F5496" w:themeColor="accent1" w:themeShade="BF" w:sz="4" w:space="10"/>
+        <w:top w:val="single" w:sz="4" w:space="10" w:color="2F5496" w:themeColor="accent1" w:themeShade="BF"/>
+        <w:bottom w:val="single" w:sz="4" w:space="10" w:color="2F5496" w:themeColor="accent1" w:themeShade="BF"/>
       </w:pBdr>
       <w:spacing w:before="360" w:after="360"/>
       <w:ind w:left="864" w:right="864"/>
@@ -4182,7 +4286,7 @@
       <w:color w:val="2F5496" w:themeColor="accent1" w:themeShade="BF"/>
     </w:rPr>
   </w:style>
-  <w:style w:type="character" w:styleId="ZvraznencitciaChar" w:customStyle="1">
+  <w:style w:type="character" w:customStyle="1" w:styleId="ZvraznencitciaChar">
     <w:name w:val="Zvýraznená citácia Char"/>
     <w:basedOn w:val="Predvolenpsmoodseku"/>
     <w:link w:val="Zvraznencitcia"/>
@@ -4208,7 +4312,7 @@
       <w:spacing w:val="5"/>
     </w:rPr>
   </w:style>
-  <w:style w:type="paragraph" w:styleId="Titlistpodnzov" w:customStyle="1">
+  <w:style w:type="paragraph" w:customStyle="1" w:styleId="Titlistpodnzov">
     <w:name w:val="Tit_list_podnázov"/>
     <w:basedOn w:val="Normlny"/>
     <w:link w:val="TitlistpodnzovChar"/>
@@ -4223,13 +4327,13 @@
       <w:szCs w:val="36"/>
     </w:rPr>
   </w:style>
-  <w:style w:type="character" w:styleId="TitlistpodnzovChar" w:customStyle="1">
+  <w:style w:type="character" w:customStyle="1" w:styleId="TitlistpodnzovChar">
     <w:name w:val="Tit_list_podnázov Char"/>
     <w:basedOn w:val="Predvolenpsmoodseku"/>
     <w:link w:val="Titlistpodnzov"/>
     <w:rsid w:val="00226EEE"/>
     <w:rPr>
-      <w:rFonts w:ascii="Arial" w:hAnsi="Arial" w:eastAsia="Times New Roman" w:cs="Times New Roman"/>
+      <w:rFonts w:ascii="Arial" w:eastAsia="Times New Roman" w:hAnsi="Arial" w:cs="Times New Roman"/>
       <w:kern w:val="0"/>
       <w:sz w:val="28"/>
       <w:szCs w:val="36"/>
@@ -4237,7 +4341,7 @@
       <w14:ligatures w14:val="none"/>
     </w:rPr>
   </w:style>
-  <w:style w:type="paragraph" w:styleId="Titlistmeno1" w:customStyle="1">
+  <w:style w:type="paragraph" w:customStyle="1" w:styleId="Titlistmeno1">
     <w:name w:val="Tit_list_meno_1"/>
     <w:basedOn w:val="Normlny"/>
     <w:link w:val="Titlistmeno1Char"/>
@@ -4253,13 +4357,13 @@
       <w:szCs w:val="28"/>
     </w:rPr>
   </w:style>
-  <w:style w:type="character" w:styleId="Titlistmeno1Char" w:customStyle="1">
+  <w:style w:type="character" w:customStyle="1" w:styleId="Titlistmeno1Char">
     <w:name w:val="Tit_list_meno_1 Char"/>
     <w:basedOn w:val="Predvolenpsmoodseku"/>
     <w:link w:val="Titlistmeno1"/>
     <w:rsid w:val="00226EEE"/>
     <w:rPr>
-      <w:rFonts w:ascii="Arial" w:hAnsi="Arial" w:eastAsia="Times New Roman" w:cs="Times New Roman"/>
+      <w:rFonts w:ascii="Arial" w:eastAsia="Times New Roman" w:hAnsi="Arial" w:cs="Times New Roman"/>
       <w:b/>
       <w:kern w:val="0"/>
       <w:sz w:val="28"/>
@@ -4268,7 +4372,7 @@
       <w14:ligatures w14:val="none"/>
     </w:rPr>
   </w:style>
-  <w:style w:type="paragraph" w:styleId="Titlistudaje" w:customStyle="1">
+  <w:style w:type="paragraph" w:customStyle="1" w:styleId="Titlistudaje">
     <w:name w:val="Tit_list_udaje"/>
     <w:basedOn w:val="Normlny"/>
     <w:link w:val="TitlistudajeChar"/>
@@ -4278,7 +4382,7 @@
       <w:spacing w:before="0"/>
     </w:pPr>
   </w:style>
-  <w:style w:type="paragraph" w:styleId="Titlistudaje1r" w:customStyle="1">
+  <w:style w:type="paragraph" w:customStyle="1" w:styleId="Titlistudaje1r">
     <w:name w:val="Tit_list_udaje_1r"/>
     <w:basedOn w:val="Titlistudaje"/>
     <w:link w:val="Titlistudaje1rChar"/>
@@ -4289,33 +4393,33 @@
       <w:jc w:val="left"/>
     </w:pPr>
   </w:style>
-  <w:style w:type="character" w:styleId="TitlistudajeChar" w:customStyle="1">
+  <w:style w:type="character" w:customStyle="1" w:styleId="TitlistudajeChar">
     <w:name w:val="Tit_list_udaje Char"/>
     <w:basedOn w:val="Predvolenpsmoodseku"/>
     <w:link w:val="Titlistudaje"/>
     <w:rsid w:val="00226EEE"/>
     <w:rPr>
-      <w:rFonts w:ascii="Arial" w:hAnsi="Arial" w:eastAsia="Times New Roman" w:cs="Times New Roman"/>
+      <w:rFonts w:ascii="Arial" w:eastAsia="Times New Roman" w:hAnsi="Arial" w:cs="Times New Roman"/>
       <w:kern w:val="0"/>
       <w:szCs w:val="24"/>
       <w:lang w:eastAsia="sk-SK"/>
       <w14:ligatures w14:val="none"/>
     </w:rPr>
   </w:style>
-  <w:style w:type="character" w:styleId="Titlistudaje1rChar" w:customStyle="1">
+  <w:style w:type="character" w:customStyle="1" w:styleId="Titlistudaje1rChar">
     <w:name w:val="Tit_list_udaje_1r Char"/>
     <w:basedOn w:val="TitlistudajeChar"/>
     <w:link w:val="Titlistudaje1r"/>
     <w:rsid w:val="00226EEE"/>
     <w:rPr>
-      <w:rFonts w:ascii="Arial" w:hAnsi="Arial" w:eastAsia="Times New Roman" w:cs="Times New Roman"/>
+      <w:rFonts w:ascii="Arial" w:eastAsia="Times New Roman" w:hAnsi="Arial" w:cs="Times New Roman"/>
       <w:kern w:val="0"/>
       <w:szCs w:val="24"/>
       <w:lang w:eastAsia="sk-SK"/>
       <w14:ligatures w14:val="none"/>
     </w:rPr>
   </w:style>
-  <w:style w:type="paragraph" w:styleId="Nzovfakulty" w:customStyle="1">
+  <w:style w:type="paragraph" w:customStyle="1" w:styleId="Nzovfakulty">
     <w:name w:val="Názov fakulty"/>
     <w:basedOn w:val="Normlny"/>
     <w:link w:val="NzovfakultyChar"/>
@@ -4331,13 +4435,13 @@
       <w:szCs w:val="28"/>
     </w:rPr>
   </w:style>
-  <w:style w:type="character" w:styleId="NzovfakultyChar" w:customStyle="1">
+  <w:style w:type="character" w:customStyle="1" w:styleId="NzovfakultyChar">
     <w:name w:val="Názov fakulty Char"/>
     <w:basedOn w:val="Predvolenpsmoodseku"/>
     <w:link w:val="Nzovfakulty"/>
     <w:rsid w:val="00226EEE"/>
     <w:rPr>
-      <w:rFonts w:ascii="Arial" w:hAnsi="Arial" w:eastAsia="Times New Roman" w:cs="Arial"/>
+      <w:rFonts w:ascii="Arial" w:eastAsia="Times New Roman" w:hAnsi="Arial" w:cs="Arial"/>
       <w:kern w:val="0"/>
       <w:sz w:val="28"/>
       <w:szCs w:val="28"/>
@@ -4345,7 +4449,7 @@
       <w14:ligatures w14:val="none"/>
     </w:rPr>
   </w:style>
-  <w:style w:type="paragraph" w:styleId="ZPTitulkahlavn" w:customStyle="1">
+  <w:style w:type="paragraph" w:customStyle="1" w:styleId="ZPTitulkahlavn">
     <w:name w:val="ZP Titulka hlavní"/>
     <w:basedOn w:val="Normlny"/>
     <w:rsid w:val="00226EEE"/>
@@ -4381,7 +4485,7 @@
       <w:jc w:val="left"/>
     </w:pPr>
     <w:rPr>
-      <w:rFonts w:ascii="Calibri" w:hAnsi="Calibri" w:eastAsia="Calibri" w:cstheme="minorBidi"/>
+      <w:rFonts w:ascii="Calibri" w:eastAsia="Calibri" w:hAnsi="Calibri" w:cstheme="minorBidi"/>
       <w:sz w:val="19"/>
       <w:szCs w:val="22"/>
       <w:lang w:val="en-US" w:eastAsia="en-US"/>
@@ -4403,12 +4507,12 @@
     </w:rPr>
     <w:tblPr>
       <w:tblBorders>
-        <w:top w:val="single" w:color="auto" w:sz="4" w:space="0"/>
-        <w:left w:val="single" w:color="auto" w:sz="4" w:space="0"/>
-        <w:bottom w:val="single" w:color="auto" w:sz="4" w:space="0"/>
-        <w:right w:val="single" w:color="auto" w:sz="4" w:space="0"/>
-        <w:insideH w:val="single" w:color="auto" w:sz="4" w:space="0"/>
-        <w:insideV w:val="single" w:color="auto" w:sz="4" w:space="0"/>
+        <w:top w:val="single" w:sz="4" w:space="0" w:color="auto"/>
+        <w:left w:val="single" w:sz="4" w:space="0" w:color="auto"/>
+        <w:bottom w:val="single" w:sz="4" w:space="0" w:color="auto"/>
+        <w:right w:val="single" w:sz="4" w:space="0" w:color="auto"/>
+        <w:insideH w:val="single" w:sz="4" w:space="0" w:color="auto"/>
+        <w:insideV w:val="single" w:sz="4" w:space="0" w:color="auto"/>
       </w:tblBorders>
     </w:tblPr>
   </w:style>
@@ -4491,31 +4595,45 @@
   </w:font>
   <w:font w:name="Times New Roman">
     <w:panose1 w:val="02020603050405020304"/>
-    <w:charset w:val="EE"/>
+    <w:charset w:val="00"/>
     <w:family w:val="roman"/>
     <w:pitch w:val="variable"/>
     <w:sig w:usb0="E0002EFF" w:usb1="C000785B" w:usb2="00000009" w:usb3="00000000" w:csb0="000001FF" w:csb1="00000000"/>
   </w:font>
+  <w:font w:name="Courier New">
+    <w:panose1 w:val="02070309020205020404"/>
+    <w:charset w:val="00"/>
+    <w:family w:val="modern"/>
+    <w:pitch w:val="fixed"/>
+    <w:sig w:usb0="E0002EFF" w:usb1="C0007843" w:usb2="00000009" w:usb3="00000000" w:csb0="000001FF" w:csb1="00000000"/>
+  </w:font>
+  <w:font w:name="Wingdings">
+    <w:panose1 w:val="05000000000000000000"/>
+    <w:charset w:val="02"/>
+    <w:family w:val="auto"/>
+    <w:pitch w:val="variable"/>
+    <w:sig w:usb0="00000000" w:usb1="10000000" w:usb2="00000000" w:usb3="00000000" w:csb0="80000000" w:csb1="00000000"/>
+  </w:font>
   <w:font w:name="Calibri">
     <w:panose1 w:val="020F0502020204030204"/>
-    <w:charset w:val="EE"/>
+    <w:charset w:val="00"/>
     <w:family w:val="swiss"/>
     <w:pitch w:val="variable"/>
-    <w:sig w:usb0="E4002EFF" w:usb1="C000247B" w:usb2="00000009" w:usb3="00000000" w:csb0="000001FF" w:csb1="00000000"/>
+    <w:sig w:usb0="E4002EFF" w:usb1="C200247B" w:usb2="00000009" w:usb3="00000000" w:csb0="000001FF" w:csb1="00000000"/>
   </w:font>
   <w:font w:name="Arial">
     <w:panose1 w:val="020B0604020202020204"/>
-    <w:charset w:val="EE"/>
+    <w:charset w:val="00"/>
     <w:family w:val="swiss"/>
     <w:pitch w:val="variable"/>
     <w:sig w:usb0="E0002EFF" w:usb1="C000785B" w:usb2="00000009" w:usb3="00000000" w:csb0="000001FF" w:csb1="00000000"/>
   </w:font>
   <w:font w:name="Calibri Light">
     <w:panose1 w:val="020F0302020204030204"/>
-    <w:charset w:val="EE"/>
+    <w:charset w:val="00"/>
     <w:family w:val="swiss"/>
     <w:pitch w:val="variable"/>
-    <w:sig w:usb0="E4002EFF" w:usb1="C000247B" w:usb2="00000009" w:usb3="00000000" w:csb0="000001FF" w:csb1="00000000"/>
+    <w:sig w:usb0="E4002EFF" w:usb1="C200247B" w:usb2="00000009" w:usb3="00000000" w:csb0="000001FF" w:csb1="00000000"/>
   </w:font>
   <w:font w:name="Aptos">
     <w:charset w:val="00"/>
@@ -4549,8 +4667,11 @@
   </w:compat>
   <w:rsids>
     <w:rsidRoot w:val="00416DB1"/>
+    <w:rsid w:val="00041870"/>
+    <w:rsid w:val="002D7391"/>
     <w:rsid w:val="00416DB1"/>
     <w:rsid w:val="00500E04"/>
+    <w:rsid w:val="00E24CCF"/>
     <w:rsid w:val="00FE4FC3"/>
   </w:rsids>
   <m:mathPr>
@@ -5012,10 +5133,6 @@
       <w:color w:val="808080"/>
     </w:rPr>
   </w:style>
-  <w:style w:type="paragraph" w:customStyle="1" w:styleId="829CEE9712424994B805B954717212D2">
-    <w:name w:val="829CEE9712424994B805B954717212D2"/>
-    <w:rsid w:val="00416DB1"/>
-  </w:style>
   <w:style w:type="paragraph" w:customStyle="1" w:styleId="44E28BB3305D4081A5538EF69979EA12">
     <w:name w:val="44E28BB3305D4081A5538EF69979EA12"/>
     <w:rsid w:val="00416DB1"/>
@@ -5035,7 +5152,7 @@
 </file>
 
 <file path=word/theme/theme1.xml><?xml version="1.0" encoding="utf-8"?>
-<a:theme xmlns:a="http://schemas.openxmlformats.org/drawingml/2006/main" xmlns:thm15="http://schemas.microsoft.com/office/thememl/2012/main" name="Office Theme">
+<a:theme xmlns:a="http://schemas.openxmlformats.org/drawingml/2006/main" name="Office Theme">
   <a:themeElements>
     <a:clrScheme name="Office">
       <a:dk1>

</xml_diff>